<commit_message>
Se agregan 12 imagenes de layout
</commit_message>
<xml_diff>
--- a/Inputs/Templates/GRI General.docx
+++ b/Inputs/Templates/GRI General.docx
@@ -76,7 +76,6 @@
           <w:lang w:val="es-ES" w:eastAsia="es-ES"/>
         </w:rPr>
       </w:pPr>
-      <w:proofErr w:type="gramStart"/>
       <w:r>
         <w:rPr>
           <w:rFonts w:eastAsia="Times New Roman" w:cstheme="minorHAnsi"/>
@@ -86,43 +85,7 @@
           <w:szCs w:val="24"/>
           <w:lang w:val="es-ES" w:eastAsia="es-ES"/>
         </w:rPr>
-        <w:t xml:space="preserve">{{ </w:t>
-      </w:r>
-      <w:proofErr w:type="spellStart"/>
-      <w:r>
-        <w:rPr>
-          <w:rFonts w:eastAsia="Times New Roman" w:cstheme="minorHAnsi"/>
-          <w:b/>
-          <w:bCs/>
-          <w:sz w:val="24"/>
-          <w:szCs w:val="24"/>
-          <w:lang w:val="es-ES" w:eastAsia="es-ES"/>
-        </w:rPr>
-        <w:t>razon</w:t>
-      </w:r>
-      <w:proofErr w:type="gramEnd"/>
-      <w:r>
-        <w:rPr>
-          <w:rFonts w:eastAsia="Times New Roman" w:cstheme="minorHAnsi"/>
-          <w:b/>
-          <w:bCs/>
-          <w:sz w:val="24"/>
-          <w:szCs w:val="24"/>
-          <w:lang w:val="es-ES" w:eastAsia="es-ES"/>
-        </w:rPr>
-        <w:t>_social</w:t>
-      </w:r>
-      <w:proofErr w:type="spellEnd"/>
-      <w:r>
-        <w:rPr>
-          <w:rFonts w:eastAsia="Times New Roman" w:cstheme="minorHAnsi"/>
-          <w:b/>
-          <w:bCs/>
-          <w:sz w:val="24"/>
-          <w:szCs w:val="24"/>
-          <w:lang w:val="es-ES" w:eastAsia="es-ES"/>
-        </w:rPr>
-        <w:t xml:space="preserve"> }}</w:t>
+        <w:t>{{ razon_social }}</w:t>
       </w:r>
     </w:p>
     <w:p>
@@ -173,23 +136,13 @@
           <w:lang w:val="es-ES"/>
         </w:rPr>
       </w:pPr>
-      <w:proofErr w:type="gramStart"/>
       <w:r>
         <w:rPr>
           <w:b/>
           <w:sz w:val="24"/>
           <w:szCs w:val="24"/>
         </w:rPr>
-        <w:t>{{ calle</w:t>
-      </w:r>
-      <w:proofErr w:type="gramEnd"/>
-      <w:r>
-        <w:rPr>
-          <w:b/>
-          <w:sz w:val="24"/>
-          <w:szCs w:val="24"/>
-        </w:rPr>
-        <w:t xml:space="preserve"> }}</w:t>
+        <w:t>{{ calle }}</w:t>
       </w:r>
       <w:r>
         <w:rPr>
@@ -205,25 +158,7 @@
           <w:sz w:val="24"/>
           <w:szCs w:val="24"/>
         </w:rPr>
-        <w:t xml:space="preserve">{{ </w:t>
-      </w:r>
-      <w:proofErr w:type="spellStart"/>
-      <w:r>
-        <w:rPr>
-          <w:b/>
-          <w:sz w:val="24"/>
-          <w:szCs w:val="24"/>
-        </w:rPr>
-        <w:t>no_exterior</w:t>
-      </w:r>
-      <w:proofErr w:type="spellEnd"/>
-      <w:r>
-        <w:rPr>
-          <w:b/>
-          <w:sz w:val="24"/>
-          <w:szCs w:val="24"/>
-        </w:rPr>
-        <w:t xml:space="preserve"> }}</w:t>
+        <w:t>{{ no_exterior }}</w:t>
       </w:r>
       <w:r>
         <w:rPr>
@@ -239,25 +174,7 @@
           <w:sz w:val="24"/>
           <w:szCs w:val="24"/>
         </w:rPr>
-        <w:t xml:space="preserve">{{ </w:t>
-      </w:r>
-      <w:proofErr w:type="spellStart"/>
-      <w:r>
-        <w:rPr>
-          <w:b/>
-          <w:sz w:val="24"/>
-          <w:szCs w:val="24"/>
-        </w:rPr>
-        <w:t>no_interior</w:t>
-      </w:r>
-      <w:proofErr w:type="spellEnd"/>
-      <w:r>
-        <w:rPr>
-          <w:b/>
-          <w:sz w:val="24"/>
-          <w:szCs w:val="24"/>
-        </w:rPr>
-        <w:t xml:space="preserve"> }}</w:t>
+        <w:t>{{ no_interior }}</w:t>
       </w:r>
       <w:r>
         <w:rPr>
@@ -273,25 +190,7 @@
           <w:sz w:val="24"/>
           <w:szCs w:val="24"/>
         </w:rPr>
-        <w:t xml:space="preserve">{{ </w:t>
-      </w:r>
-      <w:proofErr w:type="spellStart"/>
-      <w:r>
-        <w:rPr>
-          <w:b/>
-          <w:sz w:val="24"/>
-          <w:szCs w:val="24"/>
-        </w:rPr>
-        <w:t>colonia_barrio</w:t>
-      </w:r>
-      <w:proofErr w:type="spellEnd"/>
-      <w:r>
-        <w:rPr>
-          <w:b/>
-          <w:sz w:val="24"/>
-          <w:szCs w:val="24"/>
-        </w:rPr>
-        <w:t xml:space="preserve"> }}</w:t>
+        <w:t>{{ colonia_barrio }}</w:t>
       </w:r>
       <w:r>
         <w:rPr>
@@ -307,25 +206,7 @@
           <w:sz w:val="24"/>
           <w:szCs w:val="24"/>
         </w:rPr>
-        <w:t xml:space="preserve">{{ </w:t>
-      </w:r>
-      <w:proofErr w:type="spellStart"/>
-      <w:r>
-        <w:rPr>
-          <w:b/>
-          <w:sz w:val="24"/>
-          <w:szCs w:val="24"/>
-        </w:rPr>
-        <w:t>codigo_postal</w:t>
-      </w:r>
-      <w:proofErr w:type="spellEnd"/>
-      <w:r>
-        <w:rPr>
-          <w:b/>
-          <w:sz w:val="24"/>
-          <w:szCs w:val="24"/>
-        </w:rPr>
-        <w:t xml:space="preserve"> }}</w:t>
+        <w:t>{{ codigo_postal }}</w:t>
       </w:r>
       <w:r>
         <w:rPr>
@@ -432,41 +313,13 @@
           <w:szCs w:val="24"/>
         </w:rPr>
       </w:pPr>
-      <w:proofErr w:type="gramStart"/>
       <w:r>
         <w:rPr>
           <w:b/>
           <w:sz w:val="24"/>
           <w:szCs w:val="24"/>
         </w:rPr>
-        <w:t xml:space="preserve">{{ </w:t>
-      </w:r>
-      <w:proofErr w:type="spellStart"/>
-      <w:r>
-        <w:rPr>
-          <w:b/>
-          <w:sz w:val="24"/>
-          <w:szCs w:val="24"/>
-        </w:rPr>
-        <w:t>descripcion</w:t>
-      </w:r>
-      <w:proofErr w:type="gramEnd"/>
-      <w:r>
-        <w:rPr>
-          <w:b/>
-          <w:sz w:val="24"/>
-          <w:szCs w:val="24"/>
-        </w:rPr>
-        <w:t>_actividades</w:t>
-      </w:r>
-      <w:proofErr w:type="spellEnd"/>
-      <w:r>
-        <w:rPr>
-          <w:b/>
-          <w:sz w:val="24"/>
-          <w:szCs w:val="24"/>
-        </w:rPr>
-        <w:t xml:space="preserve"> }}</w:t>
+        <w:t>{{ descripcion_actividades }}</w:t>
       </w:r>
     </w:p>
     <w:p>
@@ -540,7 +393,6 @@
         </w:rPr>
         <w:t xml:space="preserve">SE CUENTA CON </w:t>
       </w:r>
-      <w:proofErr w:type="gramStart"/>
       <w:r>
         <w:rPr>
           <w:b/>
@@ -548,17 +400,7 @@
           <w:sz w:val="24"/>
           <w:szCs w:val="24"/>
         </w:rPr>
-        <w:t>{{ trabajadores</w:t>
-      </w:r>
-      <w:proofErr w:type="gramEnd"/>
-      <w:r>
-        <w:rPr>
-          <w:b/>
-          <w:bCs/>
-          <w:sz w:val="24"/>
-          <w:szCs w:val="24"/>
-        </w:rPr>
-        <w:t xml:space="preserve"> }}</w:t>
+        <w:t>{{ trabajadores }}</w:t>
       </w:r>
       <w:r>
         <w:rPr>
@@ -678,7 +520,6 @@
         </w:rPr>
         <w:t xml:space="preserve">: </w:t>
       </w:r>
-      <w:proofErr w:type="gramStart"/>
       <w:r>
         <w:rPr>
           <w:b/>
@@ -686,17 +527,7 @@
           <w:sz w:val="24"/>
           <w:szCs w:val="24"/>
         </w:rPr>
-        <w:t>{{ proveedores</w:t>
-      </w:r>
-      <w:proofErr w:type="gramEnd"/>
-      <w:r>
-        <w:rPr>
-          <w:b/>
-          <w:bCs/>
-          <w:sz w:val="24"/>
-          <w:szCs w:val="24"/>
-        </w:rPr>
-        <w:t xml:space="preserve"> }}</w:t>
+        <w:t>{{ proveedores }}</w:t>
       </w:r>
     </w:p>
     <w:p>
@@ -729,27 +560,7 @@
           <w:sz w:val="24"/>
           <w:szCs w:val="24"/>
         </w:rPr>
-        <w:t xml:space="preserve"> </w:t>
-      </w:r>
-      <w:proofErr w:type="gramStart"/>
-      <w:r>
-        <w:rPr>
-          <w:b/>
-          <w:bCs/>
-          <w:sz w:val="24"/>
-          <w:szCs w:val="24"/>
-        </w:rPr>
-        <w:t>{{ visitantes</w:t>
-      </w:r>
-      <w:proofErr w:type="gramEnd"/>
-      <w:r>
-        <w:rPr>
-          <w:b/>
-          <w:bCs/>
-          <w:sz w:val="24"/>
-          <w:szCs w:val="24"/>
-        </w:rPr>
-        <w:t xml:space="preserve"> }} VARIABLE</w:t>
+        <w:t xml:space="preserve"> {{ visitantes }} VARIABLE</w:t>
       </w:r>
     </w:p>
     <w:p>
@@ -809,25 +620,7 @@
           <w:sz w:val="24"/>
           <w:szCs w:val="24"/>
         </w:rPr>
-        <w:t xml:space="preserve">DE </w:t>
-      </w:r>
-      <w:proofErr w:type="gramStart"/>
-      <w:r>
-        <w:rPr>
-          <w:b/>
-          <w:sz w:val="24"/>
-          <w:szCs w:val="24"/>
-        </w:rPr>
-        <w:t>{{ construccion</w:t>
-      </w:r>
-      <w:proofErr w:type="gramEnd"/>
-      <w:r>
-        <w:rPr>
-          <w:b/>
-          <w:sz w:val="24"/>
-          <w:szCs w:val="24"/>
-        </w:rPr>
-        <w:t xml:space="preserve">_m2 }} </w:t>
+        <w:t xml:space="preserve">DE {{ construccion_m2 }} </w:t>
       </w:r>
       <w:r>
         <w:rPr>
@@ -1138,7 +931,6 @@
                 <w:lang w:eastAsia="es-MX"/>
               </w:rPr>
             </w:pPr>
-            <w:proofErr w:type="gramStart"/>
             <w:r>
               <w:rPr>
                 <w:rFonts w:ascii="Calibri" w:eastAsia="Times New Roman" w:hAnsi="Calibri" w:cs="Calibri"/>
@@ -1149,46 +941,7 @@
                 <w:szCs w:val="18"/>
                 <w:lang w:eastAsia="es-MX"/>
               </w:rPr>
-              <w:t xml:space="preserve">{{ </w:t>
-            </w:r>
-            <w:proofErr w:type="spellStart"/>
-            <w:r>
-              <w:rPr>
-                <w:rFonts w:ascii="Calibri" w:eastAsia="Times New Roman" w:hAnsi="Calibri" w:cs="Calibri"/>
-                <w:b/>
-                <w:bCs/>
-                <w:color w:val="000000"/>
-                <w:sz w:val="18"/>
-                <w:szCs w:val="18"/>
-                <w:lang w:eastAsia="es-MX"/>
-              </w:rPr>
-              <w:t>razon</w:t>
-            </w:r>
-            <w:proofErr w:type="gramEnd"/>
-            <w:r>
-              <w:rPr>
-                <w:rFonts w:ascii="Calibri" w:eastAsia="Times New Roman" w:hAnsi="Calibri" w:cs="Calibri"/>
-                <w:b/>
-                <w:bCs/>
-                <w:color w:val="000000"/>
-                <w:sz w:val="18"/>
-                <w:szCs w:val="18"/>
-                <w:lang w:eastAsia="es-MX"/>
-              </w:rPr>
-              <w:t>_social</w:t>
-            </w:r>
-            <w:proofErr w:type="spellEnd"/>
-            <w:r>
-              <w:rPr>
-                <w:rFonts w:ascii="Calibri" w:eastAsia="Times New Roman" w:hAnsi="Calibri" w:cs="Calibri"/>
-                <w:b/>
-                <w:bCs/>
-                <w:color w:val="000000"/>
-                <w:sz w:val="18"/>
-                <w:szCs w:val="18"/>
-                <w:lang w:eastAsia="es-MX"/>
-              </w:rPr>
-              <w:t xml:space="preserve"> }}</w:t>
+              <w:t>{{ razon_social }}</w:t>
             </w:r>
           </w:p>
         </w:tc>
@@ -1326,7 +1079,6 @@
                 <w:lang w:eastAsia="es-MX"/>
               </w:rPr>
             </w:pPr>
-            <w:proofErr w:type="gramStart"/>
             <w:r>
               <w:rPr>
                 <w:rFonts w:ascii="Calibri" w:eastAsia="Times New Roman" w:hAnsi="Calibri" w:cs="Calibri"/>
@@ -1337,9 +1089,8 @@
                 <w:szCs w:val="18"/>
                 <w:lang w:eastAsia="es-MX"/>
               </w:rPr>
-              <w:t>{{ calle</w:t>
-            </w:r>
-            <w:proofErr w:type="gramEnd"/>
+              <w:t>{{ calle }}</w:t>
+            </w:r>
             <w:r>
               <w:rPr>
                 <w:rFonts w:ascii="Calibri" w:eastAsia="Times New Roman" w:hAnsi="Calibri" w:cs="Calibri"/>
@@ -1350,7 +1101,7 @@
                 <w:szCs w:val="18"/>
                 <w:lang w:eastAsia="es-MX"/>
               </w:rPr>
-              <w:t xml:space="preserve"> }}</w:t>
+              <w:t xml:space="preserve"> #</w:t>
             </w:r>
             <w:r>
               <w:rPr>
@@ -1362,7 +1113,7 @@
                 <w:szCs w:val="18"/>
                 <w:lang w:eastAsia="es-MX"/>
               </w:rPr>
-              <w:t xml:space="preserve"> #</w:t>
+              <w:t>{{ no_exterior }}</w:t>
             </w:r>
             <w:r>
               <w:rPr>
@@ -1374,9 +1125,8 @@
                 <w:szCs w:val="18"/>
                 <w:lang w:eastAsia="es-MX"/>
               </w:rPr>
-              <w:t xml:space="preserve">{{ </w:t>
-            </w:r>
-            <w:proofErr w:type="spellStart"/>
+              <w:t xml:space="preserve"> </w:t>
+            </w:r>
             <w:r>
               <w:rPr>
                 <w:rFonts w:ascii="Calibri" w:eastAsia="Times New Roman" w:hAnsi="Calibri" w:cs="Calibri"/>
@@ -1387,9 +1137,8 @@
                 <w:szCs w:val="18"/>
                 <w:lang w:eastAsia="es-MX"/>
               </w:rPr>
-              <w:t>no_exterior</w:t>
-            </w:r>
-            <w:proofErr w:type="spellEnd"/>
+              <w:t>{{ no_interior }}</w:t>
+            </w:r>
             <w:r>
               <w:rPr>
                 <w:rFonts w:ascii="Calibri" w:eastAsia="Times New Roman" w:hAnsi="Calibri" w:cs="Calibri"/>
@@ -1400,7 +1149,7 @@
                 <w:szCs w:val="18"/>
                 <w:lang w:eastAsia="es-MX"/>
               </w:rPr>
-              <w:t xml:space="preserve"> }}</w:t>
+              <w:t xml:space="preserve"> Col. </w:t>
             </w:r>
             <w:r>
               <w:rPr>
@@ -1412,7 +1161,7 @@
                 <w:szCs w:val="18"/>
                 <w:lang w:eastAsia="es-MX"/>
               </w:rPr>
-              <w:t xml:space="preserve"> </w:t>
+              <w:t>{{ colonia_barrio }}</w:t>
             </w:r>
             <w:r>
               <w:rPr>
@@ -1424,9 +1173,8 @@
                 <w:szCs w:val="18"/>
                 <w:lang w:eastAsia="es-MX"/>
               </w:rPr>
-              <w:t xml:space="preserve">{{ </w:t>
-            </w:r>
-            <w:proofErr w:type="spellStart"/>
+              <w:t xml:space="preserve"> C.P. </w:t>
+            </w:r>
             <w:r>
               <w:rPr>
                 <w:rFonts w:ascii="Calibri" w:eastAsia="Times New Roman" w:hAnsi="Calibri" w:cs="Calibri"/>
@@ -1437,120 +1185,7 @@
                 <w:szCs w:val="18"/>
                 <w:lang w:eastAsia="es-MX"/>
               </w:rPr>
-              <w:t>no_interior</w:t>
-            </w:r>
-            <w:proofErr w:type="spellEnd"/>
-            <w:r>
-              <w:rPr>
-                <w:rFonts w:ascii="Calibri" w:eastAsia="Times New Roman" w:hAnsi="Calibri" w:cs="Calibri"/>
-                <w:b/>
-                <w:bCs/>
-                <w:color w:val="000000"/>
-                <w:sz w:val="18"/>
-                <w:szCs w:val="18"/>
-                <w:lang w:eastAsia="es-MX"/>
-              </w:rPr>
-              <w:t xml:space="preserve"> }}</w:t>
-            </w:r>
-            <w:r>
-              <w:rPr>
-                <w:rFonts w:ascii="Calibri" w:eastAsia="Times New Roman" w:hAnsi="Calibri" w:cs="Calibri"/>
-                <w:b/>
-                <w:bCs/>
-                <w:color w:val="000000"/>
-                <w:sz w:val="18"/>
-                <w:szCs w:val="18"/>
-                <w:lang w:eastAsia="es-MX"/>
-              </w:rPr>
-              <w:t xml:space="preserve"> Col. </w:t>
-            </w:r>
-            <w:r>
-              <w:rPr>
-                <w:rFonts w:ascii="Calibri" w:eastAsia="Times New Roman" w:hAnsi="Calibri" w:cs="Calibri"/>
-                <w:b/>
-                <w:bCs/>
-                <w:color w:val="000000"/>
-                <w:sz w:val="18"/>
-                <w:szCs w:val="18"/>
-                <w:lang w:eastAsia="es-MX"/>
-              </w:rPr>
-              <w:t xml:space="preserve">{{ </w:t>
-            </w:r>
-            <w:proofErr w:type="spellStart"/>
-            <w:r>
-              <w:rPr>
-                <w:rFonts w:ascii="Calibri" w:eastAsia="Times New Roman" w:hAnsi="Calibri" w:cs="Calibri"/>
-                <w:b/>
-                <w:bCs/>
-                <w:color w:val="000000"/>
-                <w:sz w:val="18"/>
-                <w:szCs w:val="18"/>
-                <w:lang w:eastAsia="es-MX"/>
-              </w:rPr>
-              <w:t>colonia_barrio</w:t>
-            </w:r>
-            <w:proofErr w:type="spellEnd"/>
-            <w:r>
-              <w:rPr>
-                <w:rFonts w:ascii="Calibri" w:eastAsia="Times New Roman" w:hAnsi="Calibri" w:cs="Calibri"/>
-                <w:b/>
-                <w:bCs/>
-                <w:color w:val="000000"/>
-                <w:sz w:val="18"/>
-                <w:szCs w:val="18"/>
-                <w:lang w:eastAsia="es-MX"/>
-              </w:rPr>
-              <w:t xml:space="preserve"> }}</w:t>
-            </w:r>
-            <w:r>
-              <w:rPr>
-                <w:rFonts w:ascii="Calibri" w:eastAsia="Times New Roman" w:hAnsi="Calibri" w:cs="Calibri"/>
-                <w:b/>
-                <w:bCs/>
-                <w:color w:val="000000"/>
-                <w:sz w:val="18"/>
-                <w:szCs w:val="18"/>
-                <w:lang w:eastAsia="es-MX"/>
-              </w:rPr>
-              <w:t xml:space="preserve"> C.P. </w:t>
-            </w:r>
-            <w:r>
-              <w:rPr>
-                <w:rFonts w:ascii="Calibri" w:eastAsia="Times New Roman" w:hAnsi="Calibri" w:cs="Calibri"/>
-                <w:b/>
-                <w:bCs/>
-                <w:color w:val="000000"/>
-                <w:sz w:val="18"/>
-                <w:szCs w:val="18"/>
-                <w:lang w:eastAsia="es-MX"/>
-              </w:rPr>
-              <w:t xml:space="preserve">{{ </w:t>
-            </w:r>
-            <w:proofErr w:type="spellStart"/>
-            <w:r>
-              <w:rPr>
-                <w:rFonts w:ascii="Calibri" w:eastAsia="Times New Roman" w:hAnsi="Calibri" w:cs="Calibri"/>
-                <w:b/>
-                <w:bCs/>
-                <w:color w:val="000000"/>
-                <w:sz w:val="18"/>
-                <w:szCs w:val="18"/>
-                <w:lang w:eastAsia="es-MX"/>
-              </w:rPr>
-              <w:t>codigo_postal</w:t>
-            </w:r>
-            <w:proofErr w:type="spellEnd"/>
-            <w:r>
-              <w:rPr>
-                <w:rFonts w:ascii="Calibri" w:eastAsia="Times New Roman" w:hAnsi="Calibri" w:cs="Calibri"/>
-                <w:b/>
-                <w:bCs/>
-                <w:color w:val="000000"/>
-                <w:sz w:val="18"/>
-                <w:szCs w:val="18"/>
-                <w:lang w:eastAsia="es-MX"/>
-              </w:rPr>
-              <w:t xml:space="preserve"> }}</w:t>
+              <w:t>{{ codigo_postal }}</w:t>
             </w:r>
             <w:r>
               <w:rPr>
@@ -1736,7 +1371,6 @@
                 <w:lang w:eastAsia="es-MX"/>
               </w:rPr>
             </w:pPr>
-            <w:proofErr w:type="gramStart"/>
             <w:r>
               <w:rPr>
                 <w:rFonts w:ascii="Calibri" w:eastAsia="Times New Roman" w:hAnsi="Calibri" w:cs="Calibri"/>
@@ -1747,46 +1381,7 @@
                 <w:szCs w:val="18"/>
                 <w:lang w:eastAsia="es-MX"/>
               </w:rPr>
-              <w:t xml:space="preserve">{{ </w:t>
-            </w:r>
-            <w:proofErr w:type="spellStart"/>
-            <w:r>
-              <w:rPr>
-                <w:rFonts w:ascii="Calibri" w:eastAsia="Times New Roman" w:hAnsi="Calibri" w:cs="Calibri"/>
-                <w:b/>
-                <w:bCs/>
-                <w:color w:val="000000"/>
-                <w:sz w:val="18"/>
-                <w:szCs w:val="18"/>
-                <w:lang w:eastAsia="es-MX"/>
-              </w:rPr>
-              <w:t>giro</w:t>
-            </w:r>
-            <w:proofErr w:type="gramEnd"/>
-            <w:r>
-              <w:rPr>
-                <w:rFonts w:ascii="Calibri" w:eastAsia="Times New Roman" w:hAnsi="Calibri" w:cs="Calibri"/>
-                <w:b/>
-                <w:bCs/>
-                <w:color w:val="000000"/>
-                <w:sz w:val="18"/>
-                <w:szCs w:val="18"/>
-                <w:lang w:eastAsia="es-MX"/>
-              </w:rPr>
-              <w:t>_comercial</w:t>
-            </w:r>
-            <w:proofErr w:type="spellEnd"/>
-            <w:r>
-              <w:rPr>
-                <w:rFonts w:ascii="Calibri" w:eastAsia="Times New Roman" w:hAnsi="Calibri" w:cs="Calibri"/>
-                <w:b/>
-                <w:bCs/>
-                <w:color w:val="000000"/>
-                <w:sz w:val="18"/>
-                <w:szCs w:val="18"/>
-                <w:lang w:eastAsia="es-MX"/>
-              </w:rPr>
-              <w:t xml:space="preserve"> }}</w:t>
+              <w:t>{{ giro_comercial }}</w:t>
             </w:r>
           </w:p>
         </w:tc>
@@ -1850,7 +1445,6 @@
                 <w:lang w:eastAsia="es-MX"/>
               </w:rPr>
             </w:pPr>
-            <w:proofErr w:type="gramStart"/>
             <w:r>
               <w:rPr>
                 <w:rFonts w:ascii="Calibri" w:eastAsia="Times New Roman" w:hAnsi="Calibri" w:cs="Calibri"/>
@@ -1859,40 +1453,7 @@
                 <w:szCs w:val="18"/>
                 <w:lang w:eastAsia="es-MX"/>
               </w:rPr>
-              <w:t xml:space="preserve">{{ </w:t>
-            </w:r>
-            <w:proofErr w:type="spellStart"/>
-            <w:r>
-              <w:rPr>
-                <w:rFonts w:ascii="Calibri" w:eastAsia="Times New Roman" w:hAnsi="Calibri" w:cs="Calibri"/>
-                <w:color w:val="000000"/>
-                <w:sz w:val="18"/>
-                <w:szCs w:val="18"/>
-                <w:lang w:eastAsia="es-MX"/>
-              </w:rPr>
-              <w:t>nombre</w:t>
-            </w:r>
-            <w:proofErr w:type="gramEnd"/>
-            <w:r>
-              <w:rPr>
-                <w:rFonts w:ascii="Calibri" w:eastAsia="Times New Roman" w:hAnsi="Calibri" w:cs="Calibri"/>
-                <w:color w:val="000000"/>
-                <w:sz w:val="18"/>
-                <w:szCs w:val="18"/>
-                <w:lang w:eastAsia="es-MX"/>
-              </w:rPr>
-              <w:t>_comercial</w:t>
-            </w:r>
-            <w:proofErr w:type="spellEnd"/>
-            <w:r>
-              <w:rPr>
-                <w:rFonts w:ascii="Calibri" w:eastAsia="Times New Roman" w:hAnsi="Calibri" w:cs="Calibri"/>
-                <w:color w:val="000000"/>
-                <w:sz w:val="18"/>
-                <w:szCs w:val="18"/>
-                <w:lang w:eastAsia="es-MX"/>
-              </w:rPr>
-              <w:t xml:space="preserve"> }}</w:t>
+              <w:t>{{ nombre_comercial }}</w:t>
             </w:r>
           </w:p>
         </w:tc>
@@ -2791,7 +2352,6 @@
                 <w:lang w:eastAsia="es-MX"/>
               </w:rPr>
             </w:pPr>
-            <w:proofErr w:type="gramStart"/>
             <w:r>
               <w:rPr>
                 <w:rFonts w:ascii="Calibri" w:eastAsia="Times New Roman" w:hAnsi="Calibri" w:cs="Calibri"/>
@@ -2800,10 +2360,29 @@
                 <w:szCs w:val="18"/>
                 <w:lang w:eastAsia="es-MX"/>
               </w:rPr>
-              <w:t xml:space="preserve">{{ </w:t>
-            </w:r>
-            <w:proofErr w:type="spellStart"/>
-            <w:r>
+              <w:t>{{ descrip_gi }}</w:t>
+            </w:r>
+          </w:p>
+        </w:tc>
+        <w:tc>
+          <w:tcPr>
+            <w:tcW w:w="988" w:type="dxa"/>
+            <w:gridSpan w:val="3"/>
+            <w:tcBorders>
+              <w:top w:val="single" w:sz="4" w:space="0" w:color="auto"/>
+              <w:left w:val="nil"/>
+              <w:bottom w:val="single" w:sz="4" w:space="0" w:color="auto"/>
+              <w:right w:val="single" w:sz="4" w:space="0" w:color="auto"/>
+            </w:tcBorders>
+            <w:shd w:val="clear" w:color="000000" w:fill="FFFF99"/>
+            <w:noWrap/>
+            <w:vAlign w:val="center"/>
+            <w:hideMark/>
+          </w:tcPr>
+          <w:p>
+            <w:pPr>
+              <w:spacing w:after="0" w:line="240" w:lineRule="auto"/>
+              <w:jc w:val="center"/>
               <w:rPr>
                 <w:rFonts w:ascii="Calibri" w:eastAsia="Times New Roman" w:hAnsi="Calibri" w:cs="Calibri"/>
                 <w:color w:val="000000"/>
@@ -2811,9 +2390,7 @@
                 <w:szCs w:val="18"/>
                 <w:lang w:eastAsia="es-MX"/>
               </w:rPr>
-              <w:t>descrip</w:t>
-            </w:r>
-            <w:proofErr w:type="gramEnd"/>
+            </w:pPr>
             <w:r>
               <w:rPr>
                 <w:rFonts w:ascii="Calibri" w:eastAsia="Times New Roman" w:hAnsi="Calibri" w:cs="Calibri"/>
@@ -2822,10 +2399,29 @@
                 <w:szCs w:val="18"/>
                 <w:lang w:eastAsia="es-MX"/>
               </w:rPr>
-              <w:t>_gi</w:t>
-            </w:r>
-            <w:proofErr w:type="spellEnd"/>
-            <w:r>
+              <w:t>{{ gas_inflamable }}</w:t>
+            </w:r>
+          </w:p>
+        </w:tc>
+        <w:tc>
+          <w:tcPr>
+            <w:tcW w:w="822" w:type="dxa"/>
+            <w:gridSpan w:val="2"/>
+            <w:tcBorders>
+              <w:top w:val="single" w:sz="4" w:space="0" w:color="auto"/>
+              <w:left w:val="nil"/>
+              <w:bottom w:val="single" w:sz="4" w:space="0" w:color="auto"/>
+              <w:right w:val="single" w:sz="4" w:space="0" w:color="auto"/>
+            </w:tcBorders>
+            <w:shd w:val="clear" w:color="000000" w:fill="FFFF99"/>
+            <w:noWrap/>
+            <w:vAlign w:val="center"/>
+            <w:hideMark/>
+          </w:tcPr>
+          <w:p>
+            <w:pPr>
+              <w:spacing w:after="0" w:line="240" w:lineRule="auto"/>
+              <w:jc w:val="center"/>
               <w:rPr>
                 <w:rFonts w:ascii="Calibri" w:eastAsia="Times New Roman" w:hAnsi="Calibri" w:cs="Calibri"/>
                 <w:color w:val="000000"/>
@@ -2833,29 +2429,8 @@
                 <w:szCs w:val="18"/>
                 <w:lang w:eastAsia="es-MX"/>
               </w:rPr>
-              <w:t xml:space="preserve"> }}</w:t>
-            </w:r>
-          </w:p>
-        </w:tc>
-        <w:tc>
-          <w:tcPr>
-            <w:tcW w:w="988" w:type="dxa"/>
-            <w:gridSpan w:val="3"/>
-            <w:tcBorders>
-              <w:top w:val="single" w:sz="4" w:space="0" w:color="auto"/>
-              <w:left w:val="nil"/>
-              <w:bottom w:val="single" w:sz="4" w:space="0" w:color="auto"/>
-              <w:right w:val="single" w:sz="4" w:space="0" w:color="auto"/>
-            </w:tcBorders>
-            <w:shd w:val="clear" w:color="000000" w:fill="FFFF99"/>
-            <w:noWrap/>
-            <w:vAlign w:val="center"/>
-            <w:hideMark/>
-          </w:tcPr>
-          <w:p>
-            <w:pPr>
-              <w:spacing w:after="0" w:line="240" w:lineRule="auto"/>
-              <w:jc w:val="center"/>
+            </w:pPr>
+            <w:r>
               <w:rPr>
                 <w:rFonts w:ascii="Calibri" w:eastAsia="Times New Roman" w:hAnsi="Calibri" w:cs="Calibri"/>
                 <w:color w:val="000000"/>
@@ -2863,92 +2438,8 @@
                 <w:szCs w:val="18"/>
                 <w:lang w:eastAsia="es-MX"/>
               </w:rPr>
-            </w:pPr>
-            <w:proofErr w:type="gramStart"/>
-            <w:r>
-              <w:rPr>
-                <w:rFonts w:ascii="Calibri" w:eastAsia="Times New Roman" w:hAnsi="Calibri" w:cs="Calibri"/>
-                <w:color w:val="000000"/>
-                <w:sz w:val="18"/>
-                <w:szCs w:val="18"/>
-                <w:lang w:eastAsia="es-MX"/>
-              </w:rPr>
-              <w:t xml:space="preserve">{{ </w:t>
-            </w:r>
-            <w:proofErr w:type="spellStart"/>
-            <w:r>
-              <w:rPr>
-                <w:rFonts w:ascii="Calibri" w:eastAsia="Times New Roman" w:hAnsi="Calibri" w:cs="Calibri"/>
-                <w:color w:val="000000"/>
-                <w:sz w:val="18"/>
-                <w:szCs w:val="18"/>
-                <w:lang w:eastAsia="es-MX"/>
-              </w:rPr>
-              <w:t>gas</w:t>
-            </w:r>
-            <w:proofErr w:type="gramEnd"/>
-            <w:r>
-              <w:rPr>
-                <w:rFonts w:ascii="Calibri" w:eastAsia="Times New Roman" w:hAnsi="Calibri" w:cs="Calibri"/>
-                <w:color w:val="000000"/>
-                <w:sz w:val="18"/>
-                <w:szCs w:val="18"/>
-                <w:lang w:eastAsia="es-MX"/>
-              </w:rPr>
-              <w:t>_inflamable</w:t>
-            </w:r>
-            <w:proofErr w:type="spellEnd"/>
-            <w:r>
-              <w:rPr>
-                <w:rFonts w:ascii="Calibri" w:eastAsia="Times New Roman" w:hAnsi="Calibri" w:cs="Calibri"/>
-                <w:color w:val="000000"/>
-                <w:sz w:val="18"/>
-                <w:szCs w:val="18"/>
-                <w:lang w:eastAsia="es-MX"/>
-              </w:rPr>
-              <w:t xml:space="preserve"> }}</w:t>
-            </w:r>
-          </w:p>
-        </w:tc>
-        <w:tc>
-          <w:tcPr>
-            <w:tcW w:w="822" w:type="dxa"/>
-            <w:gridSpan w:val="2"/>
-            <w:tcBorders>
-              <w:top w:val="single" w:sz="4" w:space="0" w:color="auto"/>
-              <w:left w:val="nil"/>
-              <w:bottom w:val="single" w:sz="4" w:space="0" w:color="auto"/>
-              <w:right w:val="single" w:sz="4" w:space="0" w:color="auto"/>
-            </w:tcBorders>
-            <w:shd w:val="clear" w:color="000000" w:fill="FFFF99"/>
-            <w:noWrap/>
-            <w:vAlign w:val="center"/>
-            <w:hideMark/>
-          </w:tcPr>
-          <w:p>
-            <w:pPr>
-              <w:spacing w:after="0" w:line="240" w:lineRule="auto"/>
-              <w:jc w:val="center"/>
-              <w:rPr>
-                <w:rFonts w:ascii="Calibri" w:eastAsia="Times New Roman" w:hAnsi="Calibri" w:cs="Calibri"/>
-                <w:color w:val="000000"/>
-                <w:sz w:val="18"/>
-                <w:szCs w:val="18"/>
-                <w:lang w:eastAsia="es-MX"/>
-              </w:rPr>
-            </w:pPr>
-            <w:proofErr w:type="spellStart"/>
-            <w:r>
-              <w:rPr>
-                <w:rFonts w:ascii="Calibri" w:eastAsia="Times New Roman" w:hAnsi="Calibri" w:cs="Calibri"/>
-                <w:color w:val="000000"/>
-                <w:sz w:val="18"/>
-                <w:szCs w:val="18"/>
-                <w:lang w:eastAsia="es-MX"/>
-              </w:rPr>
               <w:t>Lt</w:t>
             </w:r>
-            <w:proofErr w:type="spellEnd"/>
           </w:p>
         </w:tc>
       </w:tr>
@@ -3227,7 +2718,6 @@
                 <w:lang w:eastAsia="es-MX"/>
               </w:rPr>
             </w:pPr>
-            <w:proofErr w:type="gramStart"/>
             <w:r>
               <w:rPr>
                 <w:rFonts w:ascii="Calibri" w:eastAsia="Times New Roman" w:hAnsi="Calibri" w:cs="Calibri"/>
@@ -3236,10 +2726,29 @@
                 <w:szCs w:val="18"/>
                 <w:lang w:eastAsia="es-MX"/>
               </w:rPr>
-              <w:t xml:space="preserve">{{ </w:t>
-            </w:r>
-            <w:proofErr w:type="spellStart"/>
-            <w:r>
+              <w:t>{{ descrp_li }}</w:t>
+            </w:r>
+          </w:p>
+        </w:tc>
+        <w:tc>
+          <w:tcPr>
+            <w:tcW w:w="988" w:type="dxa"/>
+            <w:gridSpan w:val="3"/>
+            <w:tcBorders>
+              <w:top w:val="single" w:sz="4" w:space="0" w:color="auto"/>
+              <w:left w:val="nil"/>
+              <w:bottom w:val="single" w:sz="4" w:space="0" w:color="auto"/>
+              <w:right w:val="single" w:sz="4" w:space="0" w:color="auto"/>
+            </w:tcBorders>
+            <w:shd w:val="clear" w:color="000000" w:fill="FFFF99"/>
+            <w:noWrap/>
+            <w:vAlign w:val="center"/>
+            <w:hideMark/>
+          </w:tcPr>
+          <w:p>
+            <w:pPr>
+              <w:spacing w:after="0" w:line="240" w:lineRule="auto"/>
+              <w:jc w:val="center"/>
               <w:rPr>
                 <w:rFonts w:ascii="Calibri" w:eastAsia="Times New Roman" w:hAnsi="Calibri" w:cs="Calibri"/>
                 <w:color w:val="000000"/>
@@ -3247,9 +2756,7 @@
                 <w:szCs w:val="18"/>
                 <w:lang w:eastAsia="es-MX"/>
               </w:rPr>
-              <w:t>descrp</w:t>
-            </w:r>
-            <w:proofErr w:type="gramEnd"/>
+            </w:pPr>
             <w:r>
               <w:rPr>
                 <w:rFonts w:ascii="Calibri" w:eastAsia="Times New Roman" w:hAnsi="Calibri" w:cs="Calibri"/>
@@ -3258,10 +2765,29 @@
                 <w:szCs w:val="18"/>
                 <w:lang w:eastAsia="es-MX"/>
               </w:rPr>
-              <w:t>_li</w:t>
-            </w:r>
-            <w:proofErr w:type="spellEnd"/>
-            <w:r>
+              <w:t>{{ liquido_inflamable }}</w:t>
+            </w:r>
+          </w:p>
+        </w:tc>
+        <w:tc>
+          <w:tcPr>
+            <w:tcW w:w="822" w:type="dxa"/>
+            <w:gridSpan w:val="2"/>
+            <w:tcBorders>
+              <w:top w:val="single" w:sz="4" w:space="0" w:color="auto"/>
+              <w:left w:val="nil"/>
+              <w:bottom w:val="single" w:sz="4" w:space="0" w:color="auto"/>
+              <w:right w:val="single" w:sz="4" w:space="0" w:color="auto"/>
+            </w:tcBorders>
+            <w:shd w:val="clear" w:color="000000" w:fill="FFFF99"/>
+            <w:noWrap/>
+            <w:vAlign w:val="center"/>
+            <w:hideMark/>
+          </w:tcPr>
+          <w:p>
+            <w:pPr>
+              <w:spacing w:after="0" w:line="240" w:lineRule="auto"/>
+              <w:jc w:val="center"/>
               <w:rPr>
                 <w:rFonts w:ascii="Calibri" w:eastAsia="Times New Roman" w:hAnsi="Calibri" w:cs="Calibri"/>
                 <w:color w:val="000000"/>
@@ -3269,29 +2795,8 @@
                 <w:szCs w:val="18"/>
                 <w:lang w:eastAsia="es-MX"/>
               </w:rPr>
-              <w:t xml:space="preserve"> }}</w:t>
-            </w:r>
-          </w:p>
-        </w:tc>
-        <w:tc>
-          <w:tcPr>
-            <w:tcW w:w="988" w:type="dxa"/>
-            <w:gridSpan w:val="3"/>
-            <w:tcBorders>
-              <w:top w:val="single" w:sz="4" w:space="0" w:color="auto"/>
-              <w:left w:val="nil"/>
-              <w:bottom w:val="single" w:sz="4" w:space="0" w:color="auto"/>
-              <w:right w:val="single" w:sz="4" w:space="0" w:color="auto"/>
-            </w:tcBorders>
-            <w:shd w:val="clear" w:color="000000" w:fill="FFFF99"/>
-            <w:noWrap/>
-            <w:vAlign w:val="center"/>
-            <w:hideMark/>
-          </w:tcPr>
-          <w:p>
-            <w:pPr>
-              <w:spacing w:after="0" w:line="240" w:lineRule="auto"/>
-              <w:jc w:val="center"/>
+            </w:pPr>
+            <w:r>
               <w:rPr>
                 <w:rFonts w:ascii="Calibri" w:eastAsia="Times New Roman" w:hAnsi="Calibri" w:cs="Calibri"/>
                 <w:color w:val="000000"/>
@@ -3299,92 +2804,8 @@
                 <w:szCs w:val="18"/>
                 <w:lang w:eastAsia="es-MX"/>
               </w:rPr>
-            </w:pPr>
-            <w:proofErr w:type="gramStart"/>
-            <w:r>
-              <w:rPr>
-                <w:rFonts w:ascii="Calibri" w:eastAsia="Times New Roman" w:hAnsi="Calibri" w:cs="Calibri"/>
-                <w:color w:val="000000"/>
-                <w:sz w:val="18"/>
-                <w:szCs w:val="18"/>
-                <w:lang w:eastAsia="es-MX"/>
-              </w:rPr>
-              <w:t xml:space="preserve">{{ </w:t>
-            </w:r>
-            <w:proofErr w:type="spellStart"/>
-            <w:r>
-              <w:rPr>
-                <w:rFonts w:ascii="Calibri" w:eastAsia="Times New Roman" w:hAnsi="Calibri" w:cs="Calibri"/>
-                <w:color w:val="000000"/>
-                <w:sz w:val="18"/>
-                <w:szCs w:val="18"/>
-                <w:lang w:eastAsia="es-MX"/>
-              </w:rPr>
-              <w:t>liquido</w:t>
-            </w:r>
-            <w:proofErr w:type="gramEnd"/>
-            <w:r>
-              <w:rPr>
-                <w:rFonts w:ascii="Calibri" w:eastAsia="Times New Roman" w:hAnsi="Calibri" w:cs="Calibri"/>
-                <w:color w:val="000000"/>
-                <w:sz w:val="18"/>
-                <w:szCs w:val="18"/>
-                <w:lang w:eastAsia="es-MX"/>
-              </w:rPr>
-              <w:t>_inflamable</w:t>
-            </w:r>
-            <w:proofErr w:type="spellEnd"/>
-            <w:r>
-              <w:rPr>
-                <w:rFonts w:ascii="Calibri" w:eastAsia="Times New Roman" w:hAnsi="Calibri" w:cs="Calibri"/>
-                <w:color w:val="000000"/>
-                <w:sz w:val="18"/>
-                <w:szCs w:val="18"/>
-                <w:lang w:eastAsia="es-MX"/>
-              </w:rPr>
-              <w:t xml:space="preserve"> }}</w:t>
-            </w:r>
-          </w:p>
-        </w:tc>
-        <w:tc>
-          <w:tcPr>
-            <w:tcW w:w="822" w:type="dxa"/>
-            <w:gridSpan w:val="2"/>
-            <w:tcBorders>
-              <w:top w:val="single" w:sz="4" w:space="0" w:color="auto"/>
-              <w:left w:val="nil"/>
-              <w:bottom w:val="single" w:sz="4" w:space="0" w:color="auto"/>
-              <w:right w:val="single" w:sz="4" w:space="0" w:color="auto"/>
-            </w:tcBorders>
-            <w:shd w:val="clear" w:color="000000" w:fill="FFFF99"/>
-            <w:noWrap/>
-            <w:vAlign w:val="center"/>
-            <w:hideMark/>
-          </w:tcPr>
-          <w:p>
-            <w:pPr>
-              <w:spacing w:after="0" w:line="240" w:lineRule="auto"/>
-              <w:jc w:val="center"/>
-              <w:rPr>
-                <w:rFonts w:ascii="Calibri" w:eastAsia="Times New Roman" w:hAnsi="Calibri" w:cs="Calibri"/>
-                <w:color w:val="000000"/>
-                <w:sz w:val="18"/>
-                <w:szCs w:val="18"/>
-                <w:lang w:eastAsia="es-MX"/>
-              </w:rPr>
-            </w:pPr>
-            <w:proofErr w:type="spellStart"/>
-            <w:r>
-              <w:rPr>
-                <w:rFonts w:ascii="Calibri" w:eastAsia="Times New Roman" w:hAnsi="Calibri" w:cs="Calibri"/>
-                <w:color w:val="000000"/>
-                <w:sz w:val="18"/>
-                <w:szCs w:val="18"/>
-                <w:lang w:eastAsia="es-MX"/>
-              </w:rPr>
               <w:t>Lt</w:t>
             </w:r>
-            <w:proofErr w:type="spellEnd"/>
           </w:p>
         </w:tc>
       </w:tr>
@@ -3663,7 +3084,6 @@
                 <w:lang w:eastAsia="es-MX"/>
               </w:rPr>
             </w:pPr>
-            <w:proofErr w:type="gramStart"/>
             <w:r>
               <w:rPr>
                 <w:rFonts w:ascii="Calibri" w:eastAsia="Times New Roman" w:hAnsi="Calibri" w:cs="Calibri"/>
@@ -3672,10 +3092,28 @@
                 <w:szCs w:val="18"/>
                 <w:lang w:eastAsia="es-MX"/>
               </w:rPr>
-              <w:t xml:space="preserve">{{ </w:t>
-            </w:r>
-            <w:proofErr w:type="spellStart"/>
-            <w:r>
+              <w:t>{{ descrip_lc }}</w:t>
+            </w:r>
+          </w:p>
+        </w:tc>
+        <w:tc>
+          <w:tcPr>
+            <w:tcW w:w="988" w:type="dxa"/>
+            <w:gridSpan w:val="3"/>
+            <w:tcBorders>
+              <w:top w:val="single" w:sz="4" w:space="0" w:color="auto"/>
+              <w:left w:val="nil"/>
+              <w:bottom w:val="single" w:sz="4" w:space="0" w:color="auto"/>
+              <w:right w:val="single" w:sz="4" w:space="0" w:color="auto"/>
+            </w:tcBorders>
+            <w:shd w:val="clear" w:color="000000" w:fill="FFFF99"/>
+            <w:noWrap/>
+            <w:vAlign w:val="center"/>
+          </w:tcPr>
+          <w:p>
+            <w:pPr>
+              <w:spacing w:after="0" w:line="240" w:lineRule="auto"/>
+              <w:jc w:val="center"/>
               <w:rPr>
                 <w:rFonts w:ascii="Calibri" w:eastAsia="Times New Roman" w:hAnsi="Calibri" w:cs="Calibri"/>
                 <w:color w:val="000000"/>
@@ -3683,9 +3121,7 @@
                 <w:szCs w:val="18"/>
                 <w:lang w:eastAsia="es-MX"/>
               </w:rPr>
-              <w:t>descrip</w:t>
-            </w:r>
-            <w:proofErr w:type="gramEnd"/>
+            </w:pPr>
             <w:r>
               <w:rPr>
                 <w:rFonts w:ascii="Calibri" w:eastAsia="Times New Roman" w:hAnsi="Calibri" w:cs="Calibri"/>
@@ -3694,10 +3130,28 @@
                 <w:szCs w:val="18"/>
                 <w:lang w:eastAsia="es-MX"/>
               </w:rPr>
-              <w:t>_lc</w:t>
-            </w:r>
-            <w:proofErr w:type="spellEnd"/>
-            <w:r>
+              <w:t>{{ liquido_combustible }}</w:t>
+            </w:r>
+          </w:p>
+        </w:tc>
+        <w:tc>
+          <w:tcPr>
+            <w:tcW w:w="822" w:type="dxa"/>
+            <w:gridSpan w:val="2"/>
+            <w:tcBorders>
+              <w:top w:val="single" w:sz="4" w:space="0" w:color="auto"/>
+              <w:left w:val="nil"/>
+              <w:bottom w:val="single" w:sz="4" w:space="0" w:color="auto"/>
+              <w:right w:val="single" w:sz="4" w:space="0" w:color="auto"/>
+            </w:tcBorders>
+            <w:shd w:val="clear" w:color="000000" w:fill="FFFF99"/>
+            <w:noWrap/>
+            <w:vAlign w:val="center"/>
+          </w:tcPr>
+          <w:p>
+            <w:pPr>
+              <w:spacing w:after="0" w:line="240" w:lineRule="auto"/>
+              <w:jc w:val="center"/>
               <w:rPr>
                 <w:rFonts w:ascii="Calibri" w:eastAsia="Times New Roman" w:hAnsi="Calibri" w:cs="Calibri"/>
                 <w:color w:val="000000"/>
@@ -3705,28 +3159,8 @@
                 <w:szCs w:val="18"/>
                 <w:lang w:eastAsia="es-MX"/>
               </w:rPr>
-              <w:t xml:space="preserve"> }}</w:t>
-            </w:r>
-          </w:p>
-        </w:tc>
-        <w:tc>
-          <w:tcPr>
-            <w:tcW w:w="988" w:type="dxa"/>
-            <w:gridSpan w:val="3"/>
-            <w:tcBorders>
-              <w:top w:val="single" w:sz="4" w:space="0" w:color="auto"/>
-              <w:left w:val="nil"/>
-              <w:bottom w:val="single" w:sz="4" w:space="0" w:color="auto"/>
-              <w:right w:val="single" w:sz="4" w:space="0" w:color="auto"/>
-            </w:tcBorders>
-            <w:shd w:val="clear" w:color="000000" w:fill="FFFF99"/>
-            <w:noWrap/>
-            <w:vAlign w:val="center"/>
-          </w:tcPr>
-          <w:p>
-            <w:pPr>
-              <w:spacing w:after="0" w:line="240" w:lineRule="auto"/>
-              <w:jc w:val="center"/>
+            </w:pPr>
+            <w:r>
               <w:rPr>
                 <w:rFonts w:ascii="Calibri" w:eastAsia="Times New Roman" w:hAnsi="Calibri" w:cs="Calibri"/>
                 <w:color w:val="000000"/>
@@ -3734,91 +3168,8 @@
                 <w:szCs w:val="18"/>
                 <w:lang w:eastAsia="es-MX"/>
               </w:rPr>
-            </w:pPr>
-            <w:proofErr w:type="gramStart"/>
-            <w:r>
-              <w:rPr>
-                <w:rFonts w:ascii="Calibri" w:eastAsia="Times New Roman" w:hAnsi="Calibri" w:cs="Calibri"/>
-                <w:color w:val="000000"/>
-                <w:sz w:val="18"/>
-                <w:szCs w:val="18"/>
-                <w:lang w:eastAsia="es-MX"/>
-              </w:rPr>
-              <w:t xml:space="preserve">{{ </w:t>
-            </w:r>
-            <w:proofErr w:type="spellStart"/>
-            <w:r>
-              <w:rPr>
-                <w:rFonts w:ascii="Calibri" w:eastAsia="Times New Roman" w:hAnsi="Calibri" w:cs="Calibri"/>
-                <w:color w:val="000000"/>
-                <w:sz w:val="18"/>
-                <w:szCs w:val="18"/>
-                <w:lang w:eastAsia="es-MX"/>
-              </w:rPr>
-              <w:t>liquido</w:t>
-            </w:r>
-            <w:proofErr w:type="gramEnd"/>
-            <w:r>
-              <w:rPr>
-                <w:rFonts w:ascii="Calibri" w:eastAsia="Times New Roman" w:hAnsi="Calibri" w:cs="Calibri"/>
-                <w:color w:val="000000"/>
-                <w:sz w:val="18"/>
-                <w:szCs w:val="18"/>
-                <w:lang w:eastAsia="es-MX"/>
-              </w:rPr>
-              <w:t>_combustible</w:t>
-            </w:r>
-            <w:proofErr w:type="spellEnd"/>
-            <w:r>
-              <w:rPr>
-                <w:rFonts w:ascii="Calibri" w:eastAsia="Times New Roman" w:hAnsi="Calibri" w:cs="Calibri"/>
-                <w:color w:val="000000"/>
-                <w:sz w:val="18"/>
-                <w:szCs w:val="18"/>
-                <w:lang w:eastAsia="es-MX"/>
-              </w:rPr>
-              <w:t xml:space="preserve"> }}</w:t>
-            </w:r>
-          </w:p>
-        </w:tc>
-        <w:tc>
-          <w:tcPr>
-            <w:tcW w:w="822" w:type="dxa"/>
-            <w:gridSpan w:val="2"/>
-            <w:tcBorders>
-              <w:top w:val="single" w:sz="4" w:space="0" w:color="auto"/>
-              <w:left w:val="nil"/>
-              <w:bottom w:val="single" w:sz="4" w:space="0" w:color="auto"/>
-              <w:right w:val="single" w:sz="4" w:space="0" w:color="auto"/>
-            </w:tcBorders>
-            <w:shd w:val="clear" w:color="000000" w:fill="FFFF99"/>
-            <w:noWrap/>
-            <w:vAlign w:val="center"/>
-          </w:tcPr>
-          <w:p>
-            <w:pPr>
-              <w:spacing w:after="0" w:line="240" w:lineRule="auto"/>
-              <w:jc w:val="center"/>
-              <w:rPr>
-                <w:rFonts w:ascii="Calibri" w:eastAsia="Times New Roman" w:hAnsi="Calibri" w:cs="Calibri"/>
-                <w:color w:val="000000"/>
-                <w:sz w:val="18"/>
-                <w:szCs w:val="18"/>
-                <w:lang w:eastAsia="es-MX"/>
-              </w:rPr>
-            </w:pPr>
-            <w:proofErr w:type="spellStart"/>
-            <w:r>
-              <w:rPr>
-                <w:rFonts w:ascii="Calibri" w:eastAsia="Times New Roman" w:hAnsi="Calibri" w:cs="Calibri"/>
-                <w:color w:val="000000"/>
-                <w:sz w:val="18"/>
-                <w:szCs w:val="18"/>
-                <w:lang w:eastAsia="es-MX"/>
-              </w:rPr>
               <w:t>Lt</w:t>
             </w:r>
-            <w:proofErr w:type="spellEnd"/>
           </w:p>
         </w:tc>
       </w:tr>
@@ -4107,7 +3458,6 @@
                 <w:lang w:eastAsia="es-MX"/>
               </w:rPr>
             </w:pPr>
-            <w:proofErr w:type="gramStart"/>
             <w:r>
               <w:rPr>
                 <w:rFonts w:ascii="Calibri" w:eastAsia="Times New Roman" w:hAnsi="Calibri" w:cs="Calibri"/>
@@ -4116,10 +3466,28 @@
                 <w:szCs w:val="18"/>
                 <w:lang w:eastAsia="es-MX"/>
               </w:rPr>
-              <w:t xml:space="preserve">{{ </w:t>
-            </w:r>
-            <w:proofErr w:type="spellStart"/>
-            <w:r>
+              <w:t>{{ descrip_sc }}</w:t>
+            </w:r>
+          </w:p>
+        </w:tc>
+        <w:tc>
+          <w:tcPr>
+            <w:tcW w:w="988" w:type="dxa"/>
+            <w:gridSpan w:val="3"/>
+            <w:tcBorders>
+              <w:top w:val="single" w:sz="4" w:space="0" w:color="auto"/>
+              <w:left w:val="nil"/>
+              <w:bottom w:val="single" w:sz="4" w:space="0" w:color="auto"/>
+              <w:right w:val="single" w:sz="4" w:space="0" w:color="auto"/>
+            </w:tcBorders>
+            <w:shd w:val="clear" w:color="000000" w:fill="FFFF99"/>
+            <w:noWrap/>
+            <w:vAlign w:val="center"/>
+          </w:tcPr>
+          <w:p>
+            <w:pPr>
+              <w:spacing w:after="0" w:line="240" w:lineRule="auto"/>
+              <w:jc w:val="center"/>
               <w:rPr>
                 <w:rFonts w:ascii="Calibri" w:eastAsia="Times New Roman" w:hAnsi="Calibri" w:cs="Calibri"/>
                 <w:color w:val="000000"/>
@@ -4127,9 +3495,7 @@
                 <w:szCs w:val="18"/>
                 <w:lang w:eastAsia="es-MX"/>
               </w:rPr>
-              <w:t>descrip</w:t>
-            </w:r>
-            <w:proofErr w:type="gramEnd"/>
+            </w:pPr>
             <w:r>
               <w:rPr>
                 <w:rFonts w:ascii="Calibri" w:eastAsia="Times New Roman" w:hAnsi="Calibri" w:cs="Calibri"/>
@@ -4138,90 +3504,7 @@
                 <w:szCs w:val="18"/>
                 <w:lang w:eastAsia="es-MX"/>
               </w:rPr>
-              <w:t>_sc</w:t>
-            </w:r>
-            <w:proofErr w:type="spellEnd"/>
-            <w:r>
-              <w:rPr>
-                <w:rFonts w:ascii="Calibri" w:eastAsia="Times New Roman" w:hAnsi="Calibri" w:cs="Calibri"/>
-                <w:color w:val="000000"/>
-                <w:sz w:val="18"/>
-                <w:szCs w:val="18"/>
-                <w:lang w:eastAsia="es-MX"/>
-              </w:rPr>
-              <w:t xml:space="preserve"> }}</w:t>
-            </w:r>
-          </w:p>
-        </w:tc>
-        <w:tc>
-          <w:tcPr>
-            <w:tcW w:w="988" w:type="dxa"/>
-            <w:gridSpan w:val="3"/>
-            <w:tcBorders>
-              <w:top w:val="single" w:sz="4" w:space="0" w:color="auto"/>
-              <w:left w:val="nil"/>
-              <w:bottom w:val="single" w:sz="4" w:space="0" w:color="auto"/>
-              <w:right w:val="single" w:sz="4" w:space="0" w:color="auto"/>
-            </w:tcBorders>
-            <w:shd w:val="clear" w:color="000000" w:fill="FFFF99"/>
-            <w:noWrap/>
-            <w:vAlign w:val="center"/>
-          </w:tcPr>
-          <w:p>
-            <w:pPr>
-              <w:spacing w:after="0" w:line="240" w:lineRule="auto"/>
-              <w:jc w:val="center"/>
-              <w:rPr>
-                <w:rFonts w:ascii="Calibri" w:eastAsia="Times New Roman" w:hAnsi="Calibri" w:cs="Calibri"/>
-                <w:color w:val="000000"/>
-                <w:sz w:val="18"/>
-                <w:szCs w:val="18"/>
-                <w:lang w:eastAsia="es-MX"/>
-              </w:rPr>
-            </w:pPr>
-            <w:proofErr w:type="gramStart"/>
-            <w:r>
-              <w:rPr>
-                <w:rFonts w:ascii="Calibri" w:eastAsia="Times New Roman" w:hAnsi="Calibri" w:cs="Calibri"/>
-                <w:color w:val="000000"/>
-                <w:sz w:val="18"/>
-                <w:szCs w:val="18"/>
-                <w:lang w:eastAsia="es-MX"/>
-              </w:rPr>
-              <w:t xml:space="preserve">{{ </w:t>
-            </w:r>
-            <w:proofErr w:type="spellStart"/>
-            <w:r>
-              <w:rPr>
-                <w:rFonts w:ascii="Calibri" w:eastAsia="Times New Roman" w:hAnsi="Calibri" w:cs="Calibri"/>
-                <w:color w:val="000000"/>
-                <w:sz w:val="18"/>
-                <w:szCs w:val="18"/>
-                <w:lang w:eastAsia="es-MX"/>
-              </w:rPr>
-              <w:t>solido</w:t>
-            </w:r>
-            <w:proofErr w:type="gramEnd"/>
-            <w:r>
-              <w:rPr>
-                <w:rFonts w:ascii="Calibri" w:eastAsia="Times New Roman" w:hAnsi="Calibri" w:cs="Calibri"/>
-                <w:color w:val="000000"/>
-                <w:sz w:val="18"/>
-                <w:szCs w:val="18"/>
-                <w:lang w:eastAsia="es-MX"/>
-              </w:rPr>
-              <w:t>_combusible</w:t>
-            </w:r>
-            <w:proofErr w:type="spellEnd"/>
-            <w:r>
-              <w:rPr>
-                <w:rFonts w:ascii="Calibri" w:eastAsia="Times New Roman" w:hAnsi="Calibri" w:cs="Calibri"/>
-                <w:color w:val="000000"/>
-                <w:sz w:val="18"/>
-                <w:szCs w:val="18"/>
-                <w:lang w:eastAsia="es-MX"/>
-              </w:rPr>
-              <w:t xml:space="preserve"> }}</w:t>
+              <w:t>{{ solido_combusible }}</w:t>
             </w:r>
           </w:p>
         </w:tc>
@@ -4477,7 +3760,6 @@
                 <w:lang w:eastAsia="es-MX"/>
               </w:rPr>
             </w:pPr>
-            <w:proofErr w:type="gramStart"/>
             <w:r>
               <w:rPr>
                 <w:rFonts w:ascii="Calibri" w:eastAsia="Times New Roman" w:hAnsi="Calibri" w:cs="Calibri"/>
@@ -4488,10 +3770,68 @@
                 <w:szCs w:val="18"/>
                 <w:lang w:eastAsia="es-MX"/>
               </w:rPr>
-              <w:t>{{ turnos</w:t>
-            </w:r>
-            <w:proofErr w:type="gramEnd"/>
-            <w:r>
+              <w:t>{{ turnos }}</w:t>
+            </w:r>
+          </w:p>
+        </w:tc>
+        <w:tc>
+          <w:tcPr>
+            <w:tcW w:w="648" w:type="dxa"/>
+            <w:gridSpan w:val="2"/>
+            <w:tcBorders>
+              <w:top w:val="single" w:sz="4" w:space="0" w:color="auto"/>
+              <w:left w:val="nil"/>
+              <w:bottom w:val="single" w:sz="4" w:space="0" w:color="auto"/>
+              <w:right w:val="single" w:sz="4" w:space="0" w:color="000000"/>
+            </w:tcBorders>
+            <w:shd w:val="clear" w:color="000000" w:fill="F2F2F2"/>
+            <w:noWrap/>
+            <w:vAlign w:val="bottom"/>
+            <w:hideMark/>
+          </w:tcPr>
+          <w:p>
+            <w:pPr>
+              <w:spacing w:after="0" w:line="240" w:lineRule="auto"/>
+              <w:jc w:val="center"/>
+              <w:rPr>
+                <w:rFonts w:ascii="Calibri" w:eastAsia="Times New Roman" w:hAnsi="Calibri" w:cs="Calibri"/>
+                <w:color w:val="000000"/>
+                <w:sz w:val="18"/>
+                <w:szCs w:val="18"/>
+                <w:lang w:eastAsia="es-MX"/>
+              </w:rPr>
+            </w:pPr>
+            <w:r>
+              <w:rPr>
+                <w:rFonts w:ascii="Calibri" w:eastAsia="Times New Roman" w:hAnsi="Calibri" w:cs="Calibri"/>
+                <w:color w:val="000000"/>
+                <w:sz w:val="18"/>
+                <w:szCs w:val="18"/>
+                <w:lang w:eastAsia="es-MX"/>
+              </w:rPr>
+              <w:t>Total:</w:t>
+            </w:r>
+          </w:p>
+        </w:tc>
+        <w:tc>
+          <w:tcPr>
+            <w:tcW w:w="813" w:type="dxa"/>
+            <w:gridSpan w:val="3"/>
+            <w:tcBorders>
+              <w:top w:val="single" w:sz="4" w:space="0" w:color="auto"/>
+              <w:left w:val="nil"/>
+              <w:bottom w:val="single" w:sz="4" w:space="0" w:color="auto"/>
+              <w:right w:val="single" w:sz="4" w:space="0" w:color="auto"/>
+            </w:tcBorders>
+            <w:shd w:val="clear" w:color="000000" w:fill="FFFF99"/>
+            <w:noWrap/>
+            <w:vAlign w:val="bottom"/>
+            <w:hideMark/>
+          </w:tcPr>
+          <w:p>
+            <w:pPr>
+              <w:spacing w:after="0" w:line="240" w:lineRule="auto"/>
+              <w:jc w:val="center"/>
               <w:rPr>
                 <w:rFonts w:ascii="Calibri" w:eastAsia="Times New Roman" w:hAnsi="Calibri" w:cs="Calibri"/>
                 <w:b/>
@@ -4501,21 +3841,32 @@
                 <w:szCs w:val="18"/>
                 <w:lang w:eastAsia="es-MX"/>
               </w:rPr>
-              <w:t xml:space="preserve"> }}</w:t>
-            </w:r>
-          </w:p>
-        </w:tc>
-        <w:tc>
-          <w:tcPr>
-            <w:tcW w:w="648" w:type="dxa"/>
-            <w:gridSpan w:val="2"/>
+            </w:pPr>
+            <w:r>
+              <w:rPr>
+                <w:rFonts w:ascii="Calibri" w:eastAsia="Times New Roman" w:hAnsi="Calibri" w:cs="Calibri"/>
+                <w:b/>
+                <w:bCs/>
+                <w:color w:val="000000"/>
+                <w:sz w:val="18"/>
+                <w:szCs w:val="18"/>
+                <w:lang w:eastAsia="es-MX"/>
+              </w:rPr>
+              <w:t>{{ trabajadores }}</w:t>
+            </w:r>
+          </w:p>
+        </w:tc>
+        <w:tc>
+          <w:tcPr>
+            <w:tcW w:w="3527" w:type="dxa"/>
+            <w:gridSpan w:val="11"/>
             <w:tcBorders>
               <w:top w:val="single" w:sz="4" w:space="0" w:color="auto"/>
               <w:left w:val="nil"/>
               <w:bottom w:val="single" w:sz="4" w:space="0" w:color="auto"/>
               <w:right w:val="single" w:sz="4" w:space="0" w:color="000000"/>
             </w:tcBorders>
-            <w:shd w:val="clear" w:color="000000" w:fill="F2F2F2"/>
+            <w:shd w:val="clear" w:color="000000" w:fill="D9D9D9"/>
             <w:noWrap/>
             <w:vAlign w:val="bottom"/>
             <w:hideMark/>
@@ -4540,13 +3891,13 @@
                 <w:szCs w:val="18"/>
                 <w:lang w:eastAsia="es-MX"/>
               </w:rPr>
-              <w:t>Total:</w:t>
-            </w:r>
-          </w:p>
-        </w:tc>
-        <w:tc>
-          <w:tcPr>
-            <w:tcW w:w="813" w:type="dxa"/>
+              <w:t>Visitantes + contratistas + clientes =</w:t>
+            </w:r>
+          </w:p>
+        </w:tc>
+        <w:tc>
+          <w:tcPr>
+            <w:tcW w:w="1136" w:type="dxa"/>
             <w:gridSpan w:val="3"/>
             <w:tcBorders>
               <w:top w:val="single" w:sz="4" w:space="0" w:color="auto"/>
@@ -4573,7 +3924,6 @@
                 <w:lang w:eastAsia="es-MX"/>
               </w:rPr>
             </w:pPr>
-            <w:proofErr w:type="gramStart"/>
             <w:r>
               <w:rPr>
                 <w:rFonts w:ascii="Calibri" w:eastAsia="Times New Roman" w:hAnsi="Calibri" w:cs="Calibri"/>
@@ -4584,116 +3934,7 @@
                 <w:szCs w:val="18"/>
                 <w:lang w:eastAsia="es-MX"/>
               </w:rPr>
-              <w:t>{{ trabajadores</w:t>
-            </w:r>
-            <w:proofErr w:type="gramEnd"/>
-            <w:r>
-              <w:rPr>
-                <w:rFonts w:ascii="Calibri" w:eastAsia="Times New Roman" w:hAnsi="Calibri" w:cs="Calibri"/>
-                <w:b/>
-                <w:bCs/>
-                <w:color w:val="000000"/>
-                <w:sz w:val="18"/>
-                <w:szCs w:val="18"/>
-                <w:lang w:eastAsia="es-MX"/>
-              </w:rPr>
-              <w:t xml:space="preserve"> }}</w:t>
-            </w:r>
-          </w:p>
-        </w:tc>
-        <w:tc>
-          <w:tcPr>
-            <w:tcW w:w="3527" w:type="dxa"/>
-            <w:gridSpan w:val="11"/>
-            <w:tcBorders>
-              <w:top w:val="single" w:sz="4" w:space="0" w:color="auto"/>
-              <w:left w:val="nil"/>
-              <w:bottom w:val="single" w:sz="4" w:space="0" w:color="auto"/>
-              <w:right w:val="single" w:sz="4" w:space="0" w:color="000000"/>
-            </w:tcBorders>
-            <w:shd w:val="clear" w:color="000000" w:fill="D9D9D9"/>
-            <w:noWrap/>
-            <w:vAlign w:val="bottom"/>
-            <w:hideMark/>
-          </w:tcPr>
-          <w:p>
-            <w:pPr>
-              <w:spacing w:after="0" w:line="240" w:lineRule="auto"/>
-              <w:jc w:val="center"/>
-              <w:rPr>
-                <w:rFonts w:ascii="Calibri" w:eastAsia="Times New Roman" w:hAnsi="Calibri" w:cs="Calibri"/>
-                <w:color w:val="000000"/>
-                <w:sz w:val="18"/>
-                <w:szCs w:val="18"/>
-                <w:lang w:eastAsia="es-MX"/>
-              </w:rPr>
-            </w:pPr>
-            <w:r>
-              <w:rPr>
-                <w:rFonts w:ascii="Calibri" w:eastAsia="Times New Roman" w:hAnsi="Calibri" w:cs="Calibri"/>
-                <w:color w:val="000000"/>
-                <w:sz w:val="18"/>
-                <w:szCs w:val="18"/>
-                <w:lang w:eastAsia="es-MX"/>
-              </w:rPr>
-              <w:t>Visitantes + contratistas + clientes =</w:t>
-            </w:r>
-          </w:p>
-        </w:tc>
-        <w:tc>
-          <w:tcPr>
-            <w:tcW w:w="1136" w:type="dxa"/>
-            <w:gridSpan w:val="3"/>
-            <w:tcBorders>
-              <w:top w:val="single" w:sz="4" w:space="0" w:color="auto"/>
-              <w:left w:val="nil"/>
-              <w:bottom w:val="single" w:sz="4" w:space="0" w:color="auto"/>
-              <w:right w:val="single" w:sz="4" w:space="0" w:color="auto"/>
-            </w:tcBorders>
-            <w:shd w:val="clear" w:color="000000" w:fill="FFFF99"/>
-            <w:noWrap/>
-            <w:vAlign w:val="bottom"/>
-            <w:hideMark/>
-          </w:tcPr>
-          <w:p>
-            <w:pPr>
-              <w:spacing w:after="0" w:line="240" w:lineRule="auto"/>
-              <w:jc w:val="center"/>
-              <w:rPr>
-                <w:rFonts w:ascii="Calibri" w:eastAsia="Times New Roman" w:hAnsi="Calibri" w:cs="Calibri"/>
-                <w:b/>
-                <w:bCs/>
-                <w:color w:val="000000"/>
-                <w:sz w:val="18"/>
-                <w:szCs w:val="18"/>
-                <w:lang w:eastAsia="es-MX"/>
-              </w:rPr>
-            </w:pPr>
-            <w:proofErr w:type="gramStart"/>
-            <w:r>
-              <w:rPr>
-                <w:rFonts w:ascii="Calibri" w:eastAsia="Times New Roman" w:hAnsi="Calibri" w:cs="Calibri"/>
-                <w:b/>
-                <w:bCs/>
-                <w:color w:val="000000"/>
-                <w:sz w:val="18"/>
-                <w:szCs w:val="18"/>
-                <w:lang w:eastAsia="es-MX"/>
-              </w:rPr>
-              <w:t>{{ visitantes</w:t>
-            </w:r>
-            <w:proofErr w:type="gramEnd"/>
-            <w:r>
-              <w:rPr>
-                <w:rFonts w:ascii="Calibri" w:eastAsia="Times New Roman" w:hAnsi="Calibri" w:cs="Calibri"/>
-                <w:b/>
-                <w:bCs/>
-                <w:color w:val="000000"/>
-                <w:sz w:val="18"/>
-                <w:szCs w:val="18"/>
-                <w:lang w:eastAsia="es-MX"/>
-              </w:rPr>
-              <w:t xml:space="preserve"> }}</w:t>
+              <w:t>{{ visitantes }}</w:t>
             </w:r>
           </w:p>
         </w:tc>
@@ -5018,37 +4259,12 @@
                 <w:lang w:eastAsia="es-MX"/>
               </w:rPr>
             </w:pPr>
-            <w:proofErr w:type="gramStart"/>
             <w:r>
               <w:rPr>
                 <w:sz w:val="18"/>
                 <w:szCs w:val="18"/>
               </w:rPr>
-              <w:t xml:space="preserve">{{ </w:t>
-            </w:r>
-            <w:proofErr w:type="spellStart"/>
-            <w:r>
-              <w:rPr>
-                <w:sz w:val="18"/>
-                <w:szCs w:val="18"/>
-              </w:rPr>
-              <w:t>valor</w:t>
-            </w:r>
-            <w:proofErr w:type="gramEnd"/>
-            <w:r>
-              <w:rPr>
-                <w:sz w:val="18"/>
-                <w:szCs w:val="18"/>
-              </w:rPr>
-              <w:t>_gi</w:t>
-            </w:r>
-            <w:proofErr w:type="spellEnd"/>
-            <w:r>
-              <w:rPr>
-                <w:sz w:val="18"/>
-                <w:szCs w:val="18"/>
-              </w:rPr>
-              <w:t xml:space="preserve"> }}</w:t>
+              <w:t>{{ valor_gi }}</w:t>
             </w:r>
           </w:p>
         </w:tc>
@@ -5190,37 +4406,12 @@
                 <w:lang w:eastAsia="es-MX"/>
               </w:rPr>
             </w:pPr>
-            <w:proofErr w:type="gramStart"/>
             <w:r>
               <w:rPr>
                 <w:sz w:val="18"/>
                 <w:szCs w:val="18"/>
               </w:rPr>
-              <w:t xml:space="preserve">{{ </w:t>
-            </w:r>
-            <w:proofErr w:type="spellStart"/>
-            <w:r>
-              <w:rPr>
-                <w:sz w:val="18"/>
-                <w:szCs w:val="18"/>
-              </w:rPr>
-              <w:t>valor</w:t>
-            </w:r>
-            <w:proofErr w:type="gramEnd"/>
-            <w:r>
-              <w:rPr>
-                <w:sz w:val="18"/>
-                <w:szCs w:val="18"/>
-              </w:rPr>
-              <w:t>_li</w:t>
-            </w:r>
-            <w:proofErr w:type="spellEnd"/>
-            <w:r>
-              <w:rPr>
-                <w:sz w:val="18"/>
-                <w:szCs w:val="18"/>
-              </w:rPr>
-              <w:t xml:space="preserve"> }}</w:t>
+              <w:t>{{ valor_li }}</w:t>
             </w:r>
           </w:p>
         </w:tc>
@@ -5362,7 +4553,6 @@
                 <w:lang w:eastAsia="es-MX"/>
               </w:rPr>
             </w:pPr>
-            <w:proofErr w:type="gramStart"/>
             <w:r>
               <w:rPr>
                 <w:rFonts w:ascii="Calibri" w:eastAsia="Times New Roman" w:hAnsi="Calibri" w:cs="Calibri"/>
@@ -5371,40 +4561,7 @@
                 <w:szCs w:val="18"/>
                 <w:lang w:eastAsia="es-MX"/>
               </w:rPr>
-              <w:t xml:space="preserve">{{ </w:t>
-            </w:r>
-            <w:proofErr w:type="spellStart"/>
-            <w:r>
-              <w:rPr>
-                <w:rFonts w:ascii="Calibri" w:eastAsia="Times New Roman" w:hAnsi="Calibri" w:cs="Calibri"/>
-                <w:color w:val="000000"/>
-                <w:sz w:val="18"/>
-                <w:szCs w:val="18"/>
-                <w:lang w:eastAsia="es-MX"/>
-              </w:rPr>
-              <w:t>valor</w:t>
-            </w:r>
-            <w:proofErr w:type="gramEnd"/>
-            <w:r>
-              <w:rPr>
-                <w:rFonts w:ascii="Calibri" w:eastAsia="Times New Roman" w:hAnsi="Calibri" w:cs="Calibri"/>
-                <w:color w:val="000000"/>
-                <w:sz w:val="18"/>
-                <w:szCs w:val="18"/>
-                <w:lang w:eastAsia="es-MX"/>
-              </w:rPr>
-              <w:t>_lc</w:t>
-            </w:r>
-            <w:proofErr w:type="spellEnd"/>
-            <w:r>
-              <w:rPr>
-                <w:rFonts w:ascii="Calibri" w:eastAsia="Times New Roman" w:hAnsi="Calibri" w:cs="Calibri"/>
-                <w:color w:val="000000"/>
-                <w:sz w:val="18"/>
-                <w:szCs w:val="18"/>
-                <w:lang w:eastAsia="es-MX"/>
-              </w:rPr>
-              <w:t xml:space="preserve"> }}</w:t>
+              <w:t>{{ valor_lc }}</w:t>
             </w:r>
           </w:p>
         </w:tc>
@@ -5546,37 +4703,12 @@
                 <w:lang w:eastAsia="es-MX"/>
               </w:rPr>
             </w:pPr>
-            <w:proofErr w:type="gramStart"/>
             <w:r>
               <w:rPr>
                 <w:sz w:val="18"/>
                 <w:szCs w:val="18"/>
               </w:rPr>
-              <w:t xml:space="preserve">{{ </w:t>
-            </w:r>
-            <w:proofErr w:type="spellStart"/>
-            <w:r>
-              <w:rPr>
-                <w:sz w:val="18"/>
-                <w:szCs w:val="18"/>
-              </w:rPr>
-              <w:t>valor</w:t>
-            </w:r>
-            <w:proofErr w:type="gramEnd"/>
-            <w:r>
-              <w:rPr>
-                <w:sz w:val="18"/>
-                <w:szCs w:val="18"/>
-              </w:rPr>
-              <w:t>_sc</w:t>
-            </w:r>
-            <w:proofErr w:type="spellEnd"/>
-            <w:r>
-              <w:rPr>
-                <w:sz w:val="18"/>
-                <w:szCs w:val="18"/>
-              </w:rPr>
-              <w:t xml:space="preserve"> }}</w:t>
+              <w:t>{{ valor_sc }}</w:t>
             </w:r>
           </w:p>
         </w:tc>
@@ -5867,33 +4999,13 @@
                 <w:lang w:eastAsia="es-MX"/>
               </w:rPr>
             </w:pPr>
-            <w:proofErr w:type="gramStart"/>
-            <w:r>
-              <w:rPr>
-                <w:rFonts w:ascii="Calibri" w:eastAsia="Times New Roman" w:hAnsi="Calibri" w:cs="Calibri"/>
-                <w:color w:val="000000"/>
-                <w:lang w:eastAsia="es-MX"/>
-              </w:rPr>
-              <w:t xml:space="preserve">{{ </w:t>
-            </w:r>
-            <w:proofErr w:type="spellStart"/>
-            <w:r>
-              <w:rPr>
-                <w:rFonts w:ascii="Calibri" w:eastAsia="Times New Roman" w:hAnsi="Calibri" w:cs="Calibri"/>
-                <w:color w:val="000000"/>
-                <w:lang w:eastAsia="es-MX"/>
-              </w:rPr>
-              <w:t>dia</w:t>
-            </w:r>
-            <w:proofErr w:type="spellEnd"/>
-            <w:proofErr w:type="gramEnd"/>
-            <w:r>
-              <w:rPr>
-                <w:rFonts w:ascii="Calibri" w:eastAsia="Times New Roman" w:hAnsi="Calibri" w:cs="Calibri"/>
-                <w:color w:val="000000"/>
-                <w:lang w:eastAsia="es-MX"/>
-              </w:rPr>
-              <w:t xml:space="preserve"> }}</w:t>
+            <w:r>
+              <w:rPr>
+                <w:rFonts w:ascii="Calibri" w:eastAsia="Times New Roman" w:hAnsi="Calibri" w:cs="Calibri"/>
+                <w:color w:val="000000"/>
+                <w:lang w:eastAsia="es-MX"/>
+              </w:rPr>
+              <w:t>{{ dia }}</w:t>
             </w:r>
             <w:r>
               <w:rPr>
@@ -5925,25 +5037,7 @@
                 <w:color w:val="000000"/>
                 <w:lang w:eastAsia="es-MX"/>
               </w:rPr>
-              <w:t xml:space="preserve">{{ </w:t>
-            </w:r>
-            <w:proofErr w:type="spellStart"/>
-            <w:r>
-              <w:rPr>
-                <w:rFonts w:ascii="Calibri" w:eastAsia="Times New Roman" w:hAnsi="Calibri" w:cs="Calibri"/>
-                <w:color w:val="000000"/>
-                <w:lang w:eastAsia="es-MX"/>
-              </w:rPr>
-              <w:t>anio</w:t>
-            </w:r>
-            <w:proofErr w:type="spellEnd"/>
-            <w:r>
-              <w:rPr>
-                <w:rFonts w:ascii="Calibri" w:eastAsia="Times New Roman" w:hAnsi="Calibri" w:cs="Calibri"/>
-                <w:color w:val="000000"/>
-                <w:lang w:eastAsia="es-MX"/>
-              </w:rPr>
-              <w:t xml:space="preserve"> }}</w:t>
+              <w:t>{{ anio }}</w:t>
             </w:r>
           </w:p>
         </w:tc>
@@ -5974,7 +5068,6 @@
                 <w:lang w:eastAsia="es-MX"/>
               </w:rPr>
             </w:pPr>
-            <w:proofErr w:type="spellStart"/>
             <w:r>
               <w:rPr>
                 <w:rFonts w:ascii="Calibri" w:eastAsia="Times New Roman" w:hAnsi="Calibri" w:cs="Calibri"/>
@@ -5983,18 +5076,7 @@
                 <w:szCs w:val="18"/>
                 <w:lang w:eastAsia="es-MX"/>
               </w:rPr>
-              <w:t>Sup</w:t>
-            </w:r>
-            <w:proofErr w:type="spellEnd"/>
-            <w:r>
-              <w:rPr>
-                <w:rFonts w:ascii="Calibri" w:eastAsia="Times New Roman" w:hAnsi="Calibri" w:cs="Calibri"/>
-                <w:color w:val="000000"/>
-                <w:sz w:val="18"/>
-                <w:szCs w:val="18"/>
-                <w:lang w:eastAsia="es-MX"/>
-              </w:rPr>
-              <w:t>. Construida (m2):</w:t>
+              <w:t>Sup. Construida (m2):</w:t>
             </w:r>
           </w:p>
         </w:tc>
@@ -6023,23 +5105,13 @@
                 <w:lang w:eastAsia="es-MX"/>
               </w:rPr>
             </w:pPr>
-            <w:proofErr w:type="gramStart"/>
-            <w:r>
-              <w:rPr>
-                <w:rFonts w:ascii="Calibri" w:eastAsia="Times New Roman" w:hAnsi="Calibri" w:cs="Calibri"/>
-                <w:color w:val="000000"/>
-                <w:lang w:eastAsia="es-MX"/>
-              </w:rPr>
-              <w:t>{{ construccion</w:t>
-            </w:r>
-            <w:proofErr w:type="gramEnd"/>
-            <w:r>
-              <w:rPr>
-                <w:rFonts w:ascii="Calibri" w:eastAsia="Times New Roman" w:hAnsi="Calibri" w:cs="Calibri"/>
-                <w:color w:val="000000"/>
-                <w:lang w:eastAsia="es-MX"/>
-              </w:rPr>
-              <w:t>_m2 }}</w:t>
+            <w:r>
+              <w:rPr>
+                <w:rFonts w:ascii="Calibri" w:eastAsia="Times New Roman" w:hAnsi="Calibri" w:cs="Calibri"/>
+                <w:color w:val="000000"/>
+                <w:lang w:eastAsia="es-MX"/>
+              </w:rPr>
+              <w:t>{{ construccion_m2 }}</w:t>
             </w:r>
           </w:p>
         </w:tc>
@@ -6183,7 +5255,6 @@
                 <w:lang w:eastAsia="es-MX"/>
               </w:rPr>
             </w:pPr>
-            <w:proofErr w:type="gramStart"/>
             <w:r>
               <w:rPr>
                 <w:rFonts w:ascii="Calibri" w:eastAsia="Times New Roman" w:hAnsi="Calibri" w:cs="Calibri"/>
@@ -6194,46 +5265,7 @@
                 <w:szCs w:val="18"/>
                 <w:lang w:eastAsia="es-MX"/>
               </w:rPr>
-              <w:t xml:space="preserve">{{ </w:t>
-            </w:r>
-            <w:proofErr w:type="spellStart"/>
-            <w:r>
-              <w:rPr>
-                <w:rFonts w:ascii="Calibri" w:eastAsia="Times New Roman" w:hAnsi="Calibri" w:cs="Calibri"/>
-                <w:b/>
-                <w:bCs/>
-                <w:color w:val="FF0000"/>
-                <w:sz w:val="18"/>
-                <w:szCs w:val="18"/>
-                <w:lang w:eastAsia="es-MX"/>
-              </w:rPr>
-              <w:t>tipo</w:t>
-            </w:r>
-            <w:proofErr w:type="gramEnd"/>
-            <w:r>
-              <w:rPr>
-                <w:rFonts w:ascii="Calibri" w:eastAsia="Times New Roman" w:hAnsi="Calibri" w:cs="Calibri"/>
-                <w:b/>
-                <w:bCs/>
-                <w:color w:val="FF0000"/>
-                <w:sz w:val="18"/>
-                <w:szCs w:val="18"/>
-                <w:lang w:eastAsia="es-MX"/>
-              </w:rPr>
-              <w:t>_riesgo</w:t>
-            </w:r>
-            <w:proofErr w:type="spellEnd"/>
-            <w:r>
-              <w:rPr>
-                <w:rFonts w:ascii="Calibri" w:eastAsia="Times New Roman" w:hAnsi="Calibri" w:cs="Calibri"/>
-                <w:b/>
-                <w:bCs/>
-                <w:color w:val="FF0000"/>
-                <w:sz w:val="18"/>
-                <w:szCs w:val="18"/>
-                <w:lang w:eastAsia="es-MX"/>
-              </w:rPr>
-              <w:t xml:space="preserve"> }}</w:t>
+              <w:t>{{ tipo_riesgo }}</w:t>
             </w:r>
           </w:p>
         </w:tc>
@@ -9550,23 +8582,13 @@
                 <w:lang w:eastAsia="es-MX"/>
               </w:rPr>
             </w:pPr>
-            <w:proofErr w:type="gramStart"/>
-            <w:r>
-              <w:rPr>
-                <w:rFonts w:ascii="Calibri" w:eastAsia="Times New Roman" w:hAnsi="Calibri" w:cs="Calibri"/>
-                <w:color w:val="000000"/>
-                <w:lang w:eastAsia="es-MX"/>
-              </w:rPr>
-              <w:t>{{ extintor</w:t>
-            </w:r>
-            <w:proofErr w:type="gramEnd"/>
-            <w:r>
-              <w:rPr>
-                <w:rFonts w:ascii="Calibri" w:eastAsia="Times New Roman" w:hAnsi="Calibri" w:cs="Calibri"/>
-                <w:color w:val="000000"/>
-                <w:lang w:eastAsia="es-MX"/>
-              </w:rPr>
-              <w:t xml:space="preserve"> }}</w:t>
+            <w:r>
+              <w:rPr>
+                <w:rFonts w:ascii="Calibri" w:eastAsia="Times New Roman" w:hAnsi="Calibri" w:cs="Calibri"/>
+                <w:color w:val="000000"/>
+                <w:lang w:eastAsia="es-MX"/>
+              </w:rPr>
+              <w:t>{{ extintor }}</w:t>
             </w:r>
           </w:p>
         </w:tc>
@@ -12968,324 +11990,6 @@
         <w:szCs w:val="20"/>
       </w:rPr>
     </w:pPr>
-    <w:r>
-      <w:rPr>
-        <w:rFonts w:ascii="Calibri" w:eastAsia="Times New Roman" w:hAnsi="Calibri" w:cs="Times New Roman"/>
-        <w:noProof/>
-        <w:lang w:eastAsia="es-MX"/>
-      </w:rPr>
-      <w:drawing>
-        <wp:anchor distT="0" distB="0" distL="114300" distR="114300" simplePos="0" relativeHeight="251668480" behindDoc="1" locked="0" layoutInCell="1" allowOverlap="1" wp14:anchorId="4A9CAE32" wp14:editId="31B6F92F">
-          <wp:simplePos x="0" y="0"/>
-          <wp:positionH relativeFrom="margin">
-            <wp:posOffset>4403090</wp:posOffset>
-          </wp:positionH>
-          <wp:positionV relativeFrom="paragraph">
-            <wp:posOffset>32385</wp:posOffset>
-          </wp:positionV>
-          <wp:extent cx="684530" cy="431800"/>
-          <wp:effectExtent l="0" t="0" r="1270" b="6350"/>
-          <wp:wrapNone/>
-          <wp:docPr id="1801214737" name="Imagen 1801214737" descr="Logotipo&#10;&#10;Descripción generada automáticamente"/>
-          <wp:cNvGraphicFramePr>
-            <a:graphicFrameLocks xmlns:a="http://schemas.openxmlformats.org/drawingml/2006/main" noChangeAspect="1"/>
-          </wp:cNvGraphicFramePr>
-          <a:graphic xmlns:a="http://schemas.openxmlformats.org/drawingml/2006/main">
-            <a:graphicData uri="http://schemas.openxmlformats.org/drawingml/2006/picture">
-              <pic:pic xmlns:pic="http://schemas.openxmlformats.org/drawingml/2006/picture">
-                <pic:nvPicPr>
-                  <pic:cNvPr id="1099352104" name="Imagen 1099352104" descr="Logotipo&#10;&#10;Descripción generada automáticamente"/>
-                  <pic:cNvPicPr>
-                    <a:picLocks noChangeAspect="1" noChangeArrowheads="1"/>
-                  </pic:cNvPicPr>
-                </pic:nvPicPr>
-                <pic:blipFill>
-                  <a:blip r:embed="rId1">
-                    <a:extLst>
-                      <a:ext uri="{28A0092B-C50C-407E-A947-70E740481C1C}">
-                        <a14:useLocalDpi xmlns:a14="http://schemas.microsoft.com/office/drawing/2010/main" val="0"/>
-                      </a:ext>
-                    </a:extLst>
-                  </a:blip>
-                  <a:srcRect/>
-                  <a:stretch>
-                    <a:fillRect/>
-                  </a:stretch>
-                </pic:blipFill>
-                <pic:spPr bwMode="auto">
-                  <a:xfrm>
-                    <a:off x="0" y="0"/>
-                    <a:ext cx="684530" cy="431800"/>
-                  </a:xfrm>
-                  <a:prstGeom prst="rect">
-                    <a:avLst/>
-                  </a:prstGeom>
-                  <a:noFill/>
-                  <a:ln>
-                    <a:noFill/>
-                  </a:ln>
-                </pic:spPr>
-              </pic:pic>
-            </a:graphicData>
-          </a:graphic>
-          <wp14:sizeRelH relativeFrom="page">
-            <wp14:pctWidth>0</wp14:pctWidth>
-          </wp14:sizeRelH>
-          <wp14:sizeRelV relativeFrom="page">
-            <wp14:pctHeight>0</wp14:pctHeight>
-          </wp14:sizeRelV>
-        </wp:anchor>
-      </w:drawing>
-    </w:r>
-    <w:r>
-      <w:rPr>
-        <w:noProof/>
-        <w:lang w:eastAsia="es-MX"/>
-      </w:rPr>
-      <mc:AlternateContent>
-        <mc:Choice Requires="wps">
-          <w:drawing>
-            <wp:anchor distT="0" distB="0" distL="114300" distR="114300" simplePos="0" relativeHeight="251669504" behindDoc="0" locked="0" layoutInCell="1" allowOverlap="1" wp14:anchorId="09E1AF34" wp14:editId="595BCC3C">
-              <wp:simplePos x="0" y="0"/>
-              <wp:positionH relativeFrom="column">
-                <wp:posOffset>2426335</wp:posOffset>
-              </wp:positionH>
-              <wp:positionV relativeFrom="paragraph">
-                <wp:posOffset>6985</wp:posOffset>
-              </wp:positionV>
-              <wp:extent cx="1965960" cy="487680"/>
-              <wp:effectExtent l="0" t="0" r="0" b="7620"/>
-              <wp:wrapNone/>
-              <wp:docPr id="1448439813" name="Cuadro de texto 4"/>
-              <wp:cNvGraphicFramePr/>
-              <a:graphic xmlns:a="http://schemas.openxmlformats.org/drawingml/2006/main">
-                <a:graphicData uri="http://schemas.microsoft.com/office/word/2010/wordprocessingShape">
-                  <wps:wsp>
-                    <wps:cNvSpPr txBox="1"/>
-                    <wps:spPr>
-                      <a:xfrm>
-                        <a:off x="0" y="0"/>
-                        <a:ext cx="1965960" cy="487680"/>
-                      </a:xfrm>
-                      <a:prstGeom prst="rect">
-                        <a:avLst/>
-                      </a:prstGeom>
-                      <a:noFill/>
-                      <a:ln w="6350">
-                        <a:noFill/>
-                      </a:ln>
-                    </wps:spPr>
-                    <wps:txbx>
-                      <w:txbxContent>
-                        <w:p>
-                          <w:pPr>
-                            <w:spacing w:after="0" w:line="240" w:lineRule="auto"/>
-                            <w:jc w:val="right"/>
-                            <w:rPr>
-                              <w:sz w:val="18"/>
-                              <w:szCs w:val="18"/>
-                            </w:rPr>
-                          </w:pPr>
-                          <w:r>
-                            <w:rPr>
-                              <w:sz w:val="18"/>
-                              <w:szCs w:val="18"/>
-                            </w:rPr>
-                            <w:t>CONSULTOR: NOE MORA RAMIREZ</w:t>
-                          </w:r>
-                        </w:p>
-                        <w:p>
-                          <w:pPr>
-                            <w:spacing w:after="0" w:line="240" w:lineRule="auto"/>
-                            <w:jc w:val="right"/>
-                            <w:rPr>
-                              <w:sz w:val="18"/>
-                              <w:szCs w:val="18"/>
-                            </w:rPr>
-                          </w:pPr>
-                          <w:r>
-                            <w:rPr>
-                              <w:sz w:val="18"/>
-                              <w:szCs w:val="18"/>
-                            </w:rPr>
-                            <w:t>TELEFONO CELULAR: 2454504055</w:t>
-                          </w:r>
-                        </w:p>
-                        <w:p>
-                          <w:pPr>
-                            <w:spacing w:after="0" w:line="240" w:lineRule="auto"/>
-                            <w:jc w:val="right"/>
-                            <w:rPr>
-                              <w:sz w:val="18"/>
-                              <w:szCs w:val="18"/>
-                            </w:rPr>
-                          </w:pPr>
-                          <w:r>
-                            <w:rPr>
-                              <w:sz w:val="18"/>
-                              <w:szCs w:val="18"/>
-                            </w:rPr>
-                            <w:t>CORREO: halcon_noe@yahoo.com.mx</w:t>
-                          </w:r>
-                        </w:p>
-                      </w:txbxContent>
-                    </wps:txbx>
-                    <wps:bodyPr rot="0" spcFirstLastPara="0" vertOverflow="overflow" horzOverflow="overflow" vert="horz" wrap="square" lIns="91440" tIns="45720" rIns="91440" bIns="45720" numCol="1" spcCol="0" rtlCol="0" fromWordArt="0" anchor="t" anchorCtr="0" forceAA="0" compatLnSpc="1">
-                      <a:prstTxWarp prst="textNoShape">
-                        <a:avLst/>
-                      </a:prstTxWarp>
-                      <a:noAutofit/>
-                    </wps:bodyPr>
-                  </wps:wsp>
-                </a:graphicData>
-              </a:graphic>
-              <wp14:sizeRelH relativeFrom="margin">
-                <wp14:pctWidth>0</wp14:pctWidth>
-              </wp14:sizeRelH>
-              <wp14:sizeRelV relativeFrom="margin">
-                <wp14:pctHeight>0</wp14:pctHeight>
-              </wp14:sizeRelV>
-            </wp:anchor>
-          </w:drawing>
-        </mc:Choice>
-        <mc:Fallback>
-          <w:pict>
-            <v:shapetype w14:anchorId="09E1AF34" id="_x0000_t202" coordsize="21600,21600" o:spt="202" path="m,l,21600r21600,l21600,xe">
-              <v:stroke joinstyle="miter"/>
-              <v:path gradientshapeok="t" o:connecttype="rect"/>
-            </v:shapetype>
-            <v:shape id="Cuadro de texto 4" o:spid="_x0000_s1026" type="#_x0000_t202" style="position:absolute;margin-left:191.05pt;margin-top:.55pt;width:154.8pt;height:38.4pt;z-index:251669504;visibility:visible;mso-wrap-style:square;mso-width-percent:0;mso-height-percent:0;mso-wrap-distance-left:9pt;mso-wrap-distance-top:0;mso-wrap-distance-right:9pt;mso-wrap-distance-bottom:0;mso-position-horizontal:absolute;mso-position-horizontal-relative:text;mso-position-vertical:absolute;mso-position-vertical-relative:text;mso-width-percent:0;mso-height-percent:0;mso-width-relative:margin;mso-height-relative:margin;v-text-anchor:top" o:gfxdata="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" filled="f" stroked="f" strokeweight=".5pt">
-              <v:textbox>
-                <w:txbxContent>
-                  <w:p>
-                    <w:pPr>
-                      <w:spacing w:after="0" w:line="240" w:lineRule="auto"/>
-                      <w:jc w:val="right"/>
-                      <w:rPr>
-                        <w:sz w:val="18"/>
-                        <w:szCs w:val="18"/>
-                      </w:rPr>
-                    </w:pPr>
-                    <w:r>
-                      <w:rPr>
-                        <w:sz w:val="18"/>
-                        <w:szCs w:val="18"/>
-                      </w:rPr>
-                      <w:t>CONSULTOR: NOE MORA RAMIREZ</w:t>
-                    </w:r>
-                  </w:p>
-                  <w:p>
-                    <w:pPr>
-                      <w:spacing w:after="0" w:line="240" w:lineRule="auto"/>
-                      <w:jc w:val="right"/>
-                      <w:rPr>
-                        <w:sz w:val="18"/>
-                        <w:szCs w:val="18"/>
-                      </w:rPr>
-                    </w:pPr>
-                    <w:r>
-                      <w:rPr>
-                        <w:sz w:val="18"/>
-                        <w:szCs w:val="18"/>
-                      </w:rPr>
-                      <w:t>TELEFONO CELULAR: 2454504055</w:t>
-                    </w:r>
-                  </w:p>
-                  <w:p>
-                    <w:pPr>
-                      <w:spacing w:after="0" w:line="240" w:lineRule="auto"/>
-                      <w:jc w:val="right"/>
-                      <w:rPr>
-                        <w:sz w:val="18"/>
-                        <w:szCs w:val="18"/>
-                      </w:rPr>
-                    </w:pPr>
-                    <w:r>
-                      <w:rPr>
-                        <w:sz w:val="18"/>
-                        <w:szCs w:val="18"/>
-                      </w:rPr>
-                      <w:t>CORREO: halcon_noe@yahoo.com.mx</w:t>
-                    </w:r>
-                  </w:p>
-                </w:txbxContent>
-              </v:textbox>
-            </v:shape>
-          </w:pict>
-        </mc:Fallback>
-      </mc:AlternateContent>
-    </w:r>
-    <w:r>
-      <w:rPr>
-        <w:noProof/>
-        <w:lang w:eastAsia="es-MX"/>
-      </w:rPr>
-      <w:drawing>
-        <wp:anchor distT="0" distB="0" distL="114300" distR="114300" simplePos="0" relativeHeight="251667456" behindDoc="1" locked="0" layoutInCell="1" allowOverlap="1" wp14:anchorId="3A6A0530" wp14:editId="05DD8170">
-          <wp:simplePos x="0" y="0"/>
-          <wp:positionH relativeFrom="page">
-            <wp:posOffset>0</wp:posOffset>
-          </wp:positionH>
-          <wp:positionV relativeFrom="paragraph">
-            <wp:posOffset>67945</wp:posOffset>
-          </wp:positionV>
-          <wp:extent cx="7781925" cy="914400"/>
-          <wp:effectExtent l="0" t="0" r="9525" b="0"/>
-          <wp:wrapNone/>
-          <wp:docPr id="1586737039" name="Imagen 1586737039" descr="H:\GRUPO MILANO\FRANJA-03-03.png"/>
-          <wp:cNvGraphicFramePr>
-            <a:graphicFrameLocks xmlns:a="http://schemas.openxmlformats.org/drawingml/2006/main" noChangeAspect="1"/>
-          </wp:cNvGraphicFramePr>
-          <a:graphic xmlns:a="http://schemas.openxmlformats.org/drawingml/2006/main">
-            <a:graphicData uri="http://schemas.openxmlformats.org/drawingml/2006/picture">
-              <pic:pic xmlns:pic="http://schemas.openxmlformats.org/drawingml/2006/picture">
-                <pic:nvPicPr>
-                  <pic:cNvPr id="0" name="Picture 3" descr="H:\GRUPO MILANO\FRANJA-03-03.png"/>
-                  <pic:cNvPicPr>
-                    <a:picLocks noChangeAspect="1" noChangeArrowheads="1"/>
-                  </pic:cNvPicPr>
-                </pic:nvPicPr>
-                <pic:blipFill rotWithShape="1">
-                  <a:blip r:embed="rId2" cstate="print">
-                    <a:extLst>
-                      <a:ext uri="{28A0092B-C50C-407E-A947-70E740481C1C}">
-                        <a14:useLocalDpi xmlns:a14="http://schemas.microsoft.com/office/drawing/2010/main" val="0"/>
-                      </a:ext>
-                    </a:extLst>
-                  </a:blip>
-                  <a:srcRect t="87861"/>
-                  <a:stretch/>
-                </pic:blipFill>
-                <pic:spPr bwMode="auto">
-                  <a:xfrm>
-                    <a:off x="0" y="0"/>
-                    <a:ext cx="7781925" cy="914400"/>
-                  </a:xfrm>
-                  <a:prstGeom prst="rect">
-                    <a:avLst/>
-                  </a:prstGeom>
-                  <a:noFill/>
-                  <a:ln>
-                    <a:noFill/>
-                  </a:ln>
-                  <a:extLst>
-                    <a:ext uri="{53640926-AAD7-44D8-BBD7-CCE9431645EC}">
-                      <a14:shadowObscured xmlns:a14="http://schemas.microsoft.com/office/drawing/2010/main"/>
-                    </a:ext>
-                  </a:extLst>
-                </pic:spPr>
-              </pic:pic>
-            </a:graphicData>
-          </a:graphic>
-          <wp14:sizeRelH relativeFrom="page">
-            <wp14:pctWidth>0</wp14:pctWidth>
-          </wp14:sizeRelH>
-          <wp14:sizeRelV relativeFrom="page">
-            <wp14:pctHeight>0</wp14:pctHeight>
-          </wp14:sizeRelV>
-        </wp:anchor>
-      </w:drawing>
-    </w:r>
     <w:r>
       <w:rPr>
         <w:color w:val="8496B0" w:themeColor="text2" w:themeTint="99"/>
@@ -13622,7 +12326,14 @@
                               <w:sz w:val="18"/>
                               <w:szCs w:val="18"/>
                             </w:rPr>
-                            <w:t>CORREO: halcon_noe@yahoo.com.mx</w:t>
+                            <w:t xml:space="preserve">CORREO: </w:t>
+                          </w:r>
+                          <w:r>
+                            <w:rPr>
+                              <w:sz w:val="18"/>
+                              <w:szCs w:val="18"/>
+                            </w:rPr>
+                            <w:t>halcon_noe@yahoo.com.mx</w:t>
                           </w:r>
                         </w:p>
                       </w:txbxContent>
@@ -14047,23 +12758,7 @@
         <w:rFonts w:cstheme="minorHAnsi"/>
         <w:b/>
       </w:rPr>
-      <w:t>**</w:t>
-    </w:r>
-    <w:proofErr w:type="spellStart"/>
-    <w:r>
-      <w:rPr>
-        <w:rFonts w:cstheme="minorHAnsi"/>
-        <w:b/>
-      </w:rPr>
-      <w:t>Anio_actual</w:t>
-    </w:r>
-    <w:proofErr w:type="spellEnd"/>
-    <w:r>
-      <w:rPr>
-        <w:rFonts w:cstheme="minorHAnsi"/>
-        <w:b/>
-      </w:rPr>
-      <w:t>**</w:t>
+      <w:t>**Anio_actual**</w:t>
     </w:r>
   </w:p>
   <w:p>
@@ -14085,23 +12780,7 @@
         <w:rFonts w:cstheme="minorHAnsi"/>
         <w:b/>
       </w:rPr>
-      <w:t>**</w:t>
-    </w:r>
-    <w:proofErr w:type="spellStart"/>
-    <w:r>
-      <w:rPr>
-        <w:rFonts w:cstheme="minorHAnsi"/>
-        <w:b/>
-      </w:rPr>
-      <w:t>Razon_social</w:t>
-    </w:r>
-    <w:proofErr w:type="spellEnd"/>
-    <w:r>
-      <w:rPr>
-        <w:rFonts w:cstheme="minorHAnsi"/>
-        <w:b/>
-      </w:rPr>
-      <w:t>**</w:t>
+      <w:t>**Razon_social**</w:t>
     </w:r>
   </w:p>
   <w:p>
@@ -14118,21 +12797,7 @@
       <w:rPr>
         <w:b/>
       </w:rPr>
-      <w:t>**</w:t>
-    </w:r>
-    <w:proofErr w:type="spellStart"/>
-    <w:r>
-      <w:rPr>
-        <w:b/>
-      </w:rPr>
-      <w:t>Nombre_comercial</w:t>
-    </w:r>
-    <w:proofErr w:type="spellEnd"/>
-    <w:r>
-      <w:rPr>
-        <w:b/>
-      </w:rPr>
-      <w:t>**</w:t>
+      <w:t>**Nombre_comercial**</w:t>
     </w:r>
   </w:p>
 </w:hdr>

</xml_diff>

<commit_message>
tamanio logo ancho, BD airtable
</commit_message>
<xml_diff>
--- a/Inputs/Templates/GRI General.docx
+++ b/Inputs/Templates/GRI General.docx
@@ -85,7 +85,31 @@
           <w:szCs w:val="24"/>
           <w:lang w:val="es-ES" w:eastAsia="es-ES"/>
         </w:rPr>
-        <w:t>{{ razon_social }}</w:t>
+        <w:t xml:space="preserve">{{ </w:t>
+      </w:r>
+      <w:proofErr w:type="spellStart"/>
+      <w:r>
+        <w:rPr>
+          <w:rFonts w:eastAsia="Times New Roman" w:cstheme="minorHAnsi"/>
+          <w:b/>
+          <w:bCs/>
+          <w:sz w:val="24"/>
+          <w:szCs w:val="24"/>
+          <w:lang w:val="es-ES" w:eastAsia="es-ES"/>
+        </w:rPr>
+        <w:t>razon_social</w:t>
+      </w:r>
+      <w:proofErr w:type="spellEnd"/>
+      <w:r>
+        <w:rPr>
+          <w:rFonts w:eastAsia="Times New Roman" w:cstheme="minorHAnsi"/>
+          <w:b/>
+          <w:bCs/>
+          <w:sz w:val="24"/>
+          <w:szCs w:val="24"/>
+          <w:lang w:val="es-ES" w:eastAsia="es-ES"/>
+        </w:rPr>
+        <w:t xml:space="preserve"> }}</w:t>
       </w:r>
     </w:p>
     <w:p>
@@ -158,7 +182,25 @@
           <w:sz w:val="24"/>
           <w:szCs w:val="24"/>
         </w:rPr>
-        <w:t>{{ no_exterior }}</w:t>
+        <w:t xml:space="preserve">{{ </w:t>
+      </w:r>
+      <w:proofErr w:type="spellStart"/>
+      <w:r>
+        <w:rPr>
+          <w:b/>
+          <w:sz w:val="24"/>
+          <w:szCs w:val="24"/>
+        </w:rPr>
+        <w:t>no_exterior</w:t>
+      </w:r>
+      <w:proofErr w:type="spellEnd"/>
+      <w:r>
+        <w:rPr>
+          <w:b/>
+          <w:sz w:val="24"/>
+          <w:szCs w:val="24"/>
+        </w:rPr>
+        <w:t xml:space="preserve"> }}</w:t>
       </w:r>
       <w:r>
         <w:rPr>
@@ -174,7 +216,33 @@
           <w:sz w:val="24"/>
           <w:szCs w:val="24"/>
         </w:rPr>
-        <w:t>{{ no_interior }}</w:t>
+        <w:t xml:space="preserve">{{ </w:t>
+      </w:r>
+      <w:proofErr w:type="spellStart"/>
+      <w:r>
+        <w:rPr>
+          <w:b/>
+          <w:sz w:val="24"/>
+          <w:szCs w:val="24"/>
+        </w:rPr>
+        <w:t>no_interior</w:t>
+      </w:r>
+      <w:proofErr w:type="spellEnd"/>
+      <w:r>
+        <w:rPr>
+          <w:b/>
+          <w:sz w:val="24"/>
+          <w:szCs w:val="24"/>
+        </w:rPr>
+        <w:t xml:space="preserve"> }}</w:t>
+      </w:r>
+      <w:r>
+        <w:rPr>
+          <w:b/>
+          <w:sz w:val="24"/>
+          <w:szCs w:val="24"/>
+        </w:rPr>
+        <w:t xml:space="preserve"> </w:t>
       </w:r>
       <w:r>
         <w:rPr>
@@ -190,7 +258,25 @@
           <w:sz w:val="24"/>
           <w:szCs w:val="24"/>
         </w:rPr>
-        <w:t>{{ colonia_barrio }}</w:t>
+        <w:t xml:space="preserve">{{ </w:t>
+      </w:r>
+      <w:proofErr w:type="spellStart"/>
+      <w:r>
+        <w:rPr>
+          <w:b/>
+          <w:sz w:val="24"/>
+          <w:szCs w:val="24"/>
+        </w:rPr>
+        <w:t>colonia_barrio</w:t>
+      </w:r>
+      <w:proofErr w:type="spellEnd"/>
+      <w:r>
+        <w:rPr>
+          <w:b/>
+          <w:sz w:val="24"/>
+          <w:szCs w:val="24"/>
+        </w:rPr>
+        <w:t xml:space="preserve"> }}</w:t>
       </w:r>
       <w:r>
         <w:rPr>
@@ -206,7 +292,25 @@
           <w:sz w:val="24"/>
           <w:szCs w:val="24"/>
         </w:rPr>
-        <w:t>{{ codigo_postal }}</w:t>
+        <w:t xml:space="preserve">{{ </w:t>
+      </w:r>
+      <w:proofErr w:type="spellStart"/>
+      <w:r>
+        <w:rPr>
+          <w:b/>
+          <w:sz w:val="24"/>
+          <w:szCs w:val="24"/>
+        </w:rPr>
+        <w:t>codigo_postal</w:t>
+      </w:r>
+      <w:proofErr w:type="spellEnd"/>
+      <w:r>
+        <w:rPr>
+          <w:b/>
+          <w:sz w:val="24"/>
+          <w:szCs w:val="24"/>
+        </w:rPr>
+        <w:t xml:space="preserve"> }}</w:t>
       </w:r>
       <w:r>
         <w:rPr>
@@ -223,6 +327,14 @@
           <w:szCs w:val="24"/>
         </w:rPr>
         <w:t>{{ municipio }}</w:t>
+      </w:r>
+      <w:r>
+        <w:rPr>
+          <w:b/>
+          <w:sz w:val="24"/>
+          <w:szCs w:val="24"/>
+        </w:rPr>
+        <w:t>,</w:t>
       </w:r>
       <w:r>
         <w:rPr>
@@ -319,7 +431,25 @@
           <w:sz w:val="24"/>
           <w:szCs w:val="24"/>
         </w:rPr>
-        <w:t>{{ descripcion_actividades }}</w:t>
+        <w:t xml:space="preserve">{{ </w:t>
+      </w:r>
+      <w:proofErr w:type="spellStart"/>
+      <w:r>
+        <w:rPr>
+          <w:b/>
+          <w:sz w:val="24"/>
+          <w:szCs w:val="24"/>
+        </w:rPr>
+        <w:t>descripcion_actividades</w:t>
+      </w:r>
+      <w:proofErr w:type="spellEnd"/>
+      <w:r>
+        <w:rPr>
+          <w:b/>
+          <w:sz w:val="24"/>
+          <w:szCs w:val="24"/>
+        </w:rPr>
+        <w:t xml:space="preserve"> }}</w:t>
       </w:r>
     </w:p>
     <w:p>
@@ -941,7 +1071,33 @@
                 <w:szCs w:val="18"/>
                 <w:lang w:eastAsia="es-MX"/>
               </w:rPr>
-              <w:t>{{ razon_social }}</w:t>
+              <w:t xml:space="preserve">{{ </w:t>
+            </w:r>
+            <w:proofErr w:type="spellStart"/>
+            <w:r>
+              <w:rPr>
+                <w:rFonts w:ascii="Calibri" w:eastAsia="Times New Roman" w:hAnsi="Calibri" w:cs="Calibri"/>
+                <w:b/>
+                <w:bCs/>
+                <w:color w:val="000000"/>
+                <w:sz w:val="18"/>
+                <w:szCs w:val="18"/>
+                <w:lang w:eastAsia="es-MX"/>
+              </w:rPr>
+              <w:t>razon_social</w:t>
+            </w:r>
+            <w:proofErr w:type="spellEnd"/>
+            <w:r>
+              <w:rPr>
+                <w:rFonts w:ascii="Calibri" w:eastAsia="Times New Roman" w:hAnsi="Calibri" w:cs="Calibri"/>
+                <w:b/>
+                <w:bCs/>
+                <w:color w:val="000000"/>
+                <w:sz w:val="18"/>
+                <w:szCs w:val="18"/>
+                <w:lang w:eastAsia="es-MX"/>
+              </w:rPr>
+              <w:t xml:space="preserve"> }}</w:t>
             </w:r>
           </w:p>
         </w:tc>
@@ -1113,8 +1269,9 @@
                 <w:szCs w:val="18"/>
                 <w:lang w:eastAsia="es-MX"/>
               </w:rPr>
-              <w:t>{{ no_exterior }}</w:t>
-            </w:r>
+              <w:t xml:space="preserve">{{ </w:t>
+            </w:r>
+            <w:proofErr w:type="spellStart"/>
             <w:r>
               <w:rPr>
                 <w:rFonts w:ascii="Calibri" w:eastAsia="Times New Roman" w:hAnsi="Calibri" w:cs="Calibri"/>
@@ -1125,8 +1282,9 @@
                 <w:szCs w:val="18"/>
                 <w:lang w:eastAsia="es-MX"/>
               </w:rPr>
-              <w:t xml:space="preserve"> </w:t>
-            </w:r>
+              <w:t>no_exterior</w:t>
+            </w:r>
+            <w:proofErr w:type="spellEnd"/>
             <w:r>
               <w:rPr>
                 <w:rFonts w:ascii="Calibri" w:eastAsia="Times New Roman" w:hAnsi="Calibri" w:cs="Calibri"/>
@@ -1137,7 +1295,7 @@
                 <w:szCs w:val="18"/>
                 <w:lang w:eastAsia="es-MX"/>
               </w:rPr>
-              <w:t>{{ no_interior }}</w:t>
+              <w:t xml:space="preserve"> }}</w:t>
             </w:r>
             <w:r>
               <w:rPr>
@@ -1149,7 +1307,7 @@
                 <w:szCs w:val="18"/>
                 <w:lang w:eastAsia="es-MX"/>
               </w:rPr>
-              <w:t xml:space="preserve"> Col. </w:t>
+              <w:t xml:space="preserve"> </w:t>
             </w:r>
             <w:r>
               <w:rPr>
@@ -1161,8 +1319,9 @@
                 <w:szCs w:val="18"/>
                 <w:lang w:eastAsia="es-MX"/>
               </w:rPr>
-              <w:t>{{ colonia_barrio }}</w:t>
-            </w:r>
+              <w:t xml:space="preserve">{{ </w:t>
+            </w:r>
+            <w:proofErr w:type="spellStart"/>
             <w:r>
               <w:rPr>
                 <w:rFonts w:ascii="Calibri" w:eastAsia="Times New Roman" w:hAnsi="Calibri" w:cs="Calibri"/>
@@ -1173,8 +1332,9 @@
                 <w:szCs w:val="18"/>
                 <w:lang w:eastAsia="es-MX"/>
               </w:rPr>
-              <w:t xml:space="preserve"> C.P. </w:t>
-            </w:r>
+              <w:t>no_interior</w:t>
+            </w:r>
+            <w:proofErr w:type="spellEnd"/>
             <w:r>
               <w:rPr>
                 <w:rFonts w:ascii="Calibri" w:eastAsia="Times New Roman" w:hAnsi="Calibri" w:cs="Calibri"/>
@@ -1185,7 +1345,107 @@
                 <w:szCs w:val="18"/>
                 <w:lang w:eastAsia="es-MX"/>
               </w:rPr>
-              <w:t>{{ codigo_postal }}</w:t>
+              <w:t xml:space="preserve"> }}</w:t>
+            </w:r>
+            <w:r>
+              <w:rPr>
+                <w:rFonts w:ascii="Calibri" w:eastAsia="Times New Roman" w:hAnsi="Calibri" w:cs="Calibri"/>
+                <w:b/>
+                <w:bCs/>
+                <w:color w:val="000000"/>
+                <w:sz w:val="18"/>
+                <w:szCs w:val="18"/>
+                <w:lang w:eastAsia="es-MX"/>
+              </w:rPr>
+              <w:t xml:space="preserve"> Col. </w:t>
+            </w:r>
+            <w:r>
+              <w:rPr>
+                <w:rFonts w:ascii="Calibri" w:eastAsia="Times New Roman" w:hAnsi="Calibri" w:cs="Calibri"/>
+                <w:b/>
+                <w:bCs/>
+                <w:color w:val="000000"/>
+                <w:sz w:val="18"/>
+                <w:szCs w:val="18"/>
+                <w:lang w:eastAsia="es-MX"/>
+              </w:rPr>
+              <w:t xml:space="preserve">{{ </w:t>
+            </w:r>
+            <w:proofErr w:type="spellStart"/>
+            <w:r>
+              <w:rPr>
+                <w:rFonts w:ascii="Calibri" w:eastAsia="Times New Roman" w:hAnsi="Calibri" w:cs="Calibri"/>
+                <w:b/>
+                <w:bCs/>
+                <w:color w:val="000000"/>
+                <w:sz w:val="18"/>
+                <w:szCs w:val="18"/>
+                <w:lang w:eastAsia="es-MX"/>
+              </w:rPr>
+              <w:t>colonia_barrio</w:t>
+            </w:r>
+            <w:proofErr w:type="spellEnd"/>
+            <w:r>
+              <w:rPr>
+                <w:rFonts w:ascii="Calibri" w:eastAsia="Times New Roman" w:hAnsi="Calibri" w:cs="Calibri"/>
+                <w:b/>
+                <w:bCs/>
+                <w:color w:val="000000"/>
+                <w:sz w:val="18"/>
+                <w:szCs w:val="18"/>
+                <w:lang w:eastAsia="es-MX"/>
+              </w:rPr>
+              <w:t xml:space="preserve"> }}</w:t>
+            </w:r>
+            <w:r>
+              <w:rPr>
+                <w:rFonts w:ascii="Calibri" w:eastAsia="Times New Roman" w:hAnsi="Calibri" w:cs="Calibri"/>
+                <w:b/>
+                <w:bCs/>
+                <w:color w:val="000000"/>
+                <w:sz w:val="18"/>
+                <w:szCs w:val="18"/>
+                <w:lang w:eastAsia="es-MX"/>
+              </w:rPr>
+              <w:t xml:space="preserve"> C.P. </w:t>
+            </w:r>
+            <w:r>
+              <w:rPr>
+                <w:rFonts w:ascii="Calibri" w:eastAsia="Times New Roman" w:hAnsi="Calibri" w:cs="Calibri"/>
+                <w:b/>
+                <w:bCs/>
+                <w:color w:val="000000"/>
+                <w:sz w:val="18"/>
+                <w:szCs w:val="18"/>
+                <w:lang w:eastAsia="es-MX"/>
+              </w:rPr>
+              <w:t xml:space="preserve">{{ </w:t>
+            </w:r>
+            <w:proofErr w:type="spellStart"/>
+            <w:r>
+              <w:rPr>
+                <w:rFonts w:ascii="Calibri" w:eastAsia="Times New Roman" w:hAnsi="Calibri" w:cs="Calibri"/>
+                <w:b/>
+                <w:bCs/>
+                <w:color w:val="000000"/>
+                <w:sz w:val="18"/>
+                <w:szCs w:val="18"/>
+                <w:lang w:eastAsia="es-MX"/>
+              </w:rPr>
+              <w:t>codigo_postal</w:t>
+            </w:r>
+            <w:proofErr w:type="spellEnd"/>
+            <w:r>
+              <w:rPr>
+                <w:rFonts w:ascii="Calibri" w:eastAsia="Times New Roman" w:hAnsi="Calibri" w:cs="Calibri"/>
+                <w:b/>
+                <w:bCs/>
+                <w:color w:val="000000"/>
+                <w:sz w:val="18"/>
+                <w:szCs w:val="18"/>
+                <w:lang w:eastAsia="es-MX"/>
+              </w:rPr>
+              <w:t xml:space="preserve"> }}</w:t>
             </w:r>
             <w:r>
               <w:rPr>
@@ -1381,7 +1641,33 @@
                 <w:szCs w:val="18"/>
                 <w:lang w:eastAsia="es-MX"/>
               </w:rPr>
-              <w:t>{{ giro_comercial }}</w:t>
+              <w:t xml:space="preserve">{{ </w:t>
+            </w:r>
+            <w:proofErr w:type="spellStart"/>
+            <w:r>
+              <w:rPr>
+                <w:rFonts w:ascii="Calibri" w:eastAsia="Times New Roman" w:hAnsi="Calibri" w:cs="Calibri"/>
+                <w:b/>
+                <w:bCs/>
+                <w:color w:val="000000"/>
+                <w:sz w:val="18"/>
+                <w:szCs w:val="18"/>
+                <w:lang w:eastAsia="es-MX"/>
+              </w:rPr>
+              <w:t>giro_comercial</w:t>
+            </w:r>
+            <w:proofErr w:type="spellEnd"/>
+            <w:r>
+              <w:rPr>
+                <w:rFonts w:ascii="Calibri" w:eastAsia="Times New Roman" w:hAnsi="Calibri" w:cs="Calibri"/>
+                <w:b/>
+                <w:bCs/>
+                <w:color w:val="000000"/>
+                <w:sz w:val="18"/>
+                <w:szCs w:val="18"/>
+                <w:lang w:eastAsia="es-MX"/>
+              </w:rPr>
+              <w:t xml:space="preserve"> }}</w:t>
             </w:r>
           </w:p>
         </w:tc>
@@ -1453,7 +1739,29 @@
                 <w:szCs w:val="18"/>
                 <w:lang w:eastAsia="es-MX"/>
               </w:rPr>
-              <w:t>{{ nombre_comercial }}</w:t>
+              <w:t xml:space="preserve">{{ </w:t>
+            </w:r>
+            <w:proofErr w:type="spellStart"/>
+            <w:r>
+              <w:rPr>
+                <w:rFonts w:ascii="Calibri" w:eastAsia="Times New Roman" w:hAnsi="Calibri" w:cs="Calibri"/>
+                <w:color w:val="000000"/>
+                <w:sz w:val="18"/>
+                <w:szCs w:val="18"/>
+                <w:lang w:eastAsia="es-MX"/>
+              </w:rPr>
+              <w:t>nombre_comercial</w:t>
+            </w:r>
+            <w:proofErr w:type="spellEnd"/>
+            <w:r>
+              <w:rPr>
+                <w:rFonts w:ascii="Calibri" w:eastAsia="Times New Roman" w:hAnsi="Calibri" w:cs="Calibri"/>
+                <w:color w:val="000000"/>
+                <w:sz w:val="18"/>
+                <w:szCs w:val="18"/>
+                <w:lang w:eastAsia="es-MX"/>
+              </w:rPr>
+              <w:t xml:space="preserve"> }}</w:t>
             </w:r>
           </w:p>
         </w:tc>
@@ -2360,7 +2668,29 @@
                 <w:szCs w:val="18"/>
                 <w:lang w:eastAsia="es-MX"/>
               </w:rPr>
-              <w:t>{{ descrip_gi }}</w:t>
+              <w:t xml:space="preserve">{{ </w:t>
+            </w:r>
+            <w:proofErr w:type="spellStart"/>
+            <w:r>
+              <w:rPr>
+                <w:rFonts w:ascii="Calibri" w:eastAsia="Times New Roman" w:hAnsi="Calibri" w:cs="Calibri"/>
+                <w:color w:val="000000"/>
+                <w:sz w:val="18"/>
+                <w:szCs w:val="18"/>
+                <w:lang w:eastAsia="es-MX"/>
+              </w:rPr>
+              <w:t>descrip_gi</w:t>
+            </w:r>
+            <w:proofErr w:type="spellEnd"/>
+            <w:r>
+              <w:rPr>
+                <w:rFonts w:ascii="Calibri" w:eastAsia="Times New Roman" w:hAnsi="Calibri" w:cs="Calibri"/>
+                <w:color w:val="000000"/>
+                <w:sz w:val="18"/>
+                <w:szCs w:val="18"/>
+                <w:lang w:eastAsia="es-MX"/>
+              </w:rPr>
+              <w:t xml:space="preserve"> }}</w:t>
             </w:r>
           </w:p>
         </w:tc>
@@ -2399,7 +2729,29 @@
                 <w:szCs w:val="18"/>
                 <w:lang w:eastAsia="es-MX"/>
               </w:rPr>
-              <w:t>{{ gas_inflamable }}</w:t>
+              <w:t xml:space="preserve">{{ </w:t>
+            </w:r>
+            <w:proofErr w:type="spellStart"/>
+            <w:r>
+              <w:rPr>
+                <w:rFonts w:ascii="Calibri" w:eastAsia="Times New Roman" w:hAnsi="Calibri" w:cs="Calibri"/>
+                <w:color w:val="000000"/>
+                <w:sz w:val="18"/>
+                <w:szCs w:val="18"/>
+                <w:lang w:eastAsia="es-MX"/>
+              </w:rPr>
+              <w:t>gas_inflamable</w:t>
+            </w:r>
+            <w:proofErr w:type="spellEnd"/>
+            <w:r>
+              <w:rPr>
+                <w:rFonts w:ascii="Calibri" w:eastAsia="Times New Roman" w:hAnsi="Calibri" w:cs="Calibri"/>
+                <w:color w:val="000000"/>
+                <w:sz w:val="18"/>
+                <w:szCs w:val="18"/>
+                <w:lang w:eastAsia="es-MX"/>
+              </w:rPr>
+              <w:t xml:space="preserve"> }}</w:t>
             </w:r>
           </w:p>
         </w:tc>
@@ -2430,6 +2782,7 @@
                 <w:lang w:eastAsia="es-MX"/>
               </w:rPr>
             </w:pPr>
+            <w:proofErr w:type="spellStart"/>
             <w:r>
               <w:rPr>
                 <w:rFonts w:ascii="Calibri" w:eastAsia="Times New Roman" w:hAnsi="Calibri" w:cs="Calibri"/>
@@ -2440,6 +2793,7 @@
               </w:rPr>
               <w:t>Lt</w:t>
             </w:r>
+            <w:proofErr w:type="spellEnd"/>
           </w:p>
         </w:tc>
       </w:tr>
@@ -2726,7 +3080,29 @@
                 <w:szCs w:val="18"/>
                 <w:lang w:eastAsia="es-MX"/>
               </w:rPr>
-              <w:t>{{ descrp_li }}</w:t>
+              <w:t xml:space="preserve">{{ </w:t>
+            </w:r>
+            <w:proofErr w:type="spellStart"/>
+            <w:r>
+              <w:rPr>
+                <w:rFonts w:ascii="Calibri" w:eastAsia="Times New Roman" w:hAnsi="Calibri" w:cs="Calibri"/>
+                <w:color w:val="000000"/>
+                <w:sz w:val="18"/>
+                <w:szCs w:val="18"/>
+                <w:lang w:eastAsia="es-MX"/>
+              </w:rPr>
+              <w:t>descrp_li</w:t>
+            </w:r>
+            <w:proofErr w:type="spellEnd"/>
+            <w:r>
+              <w:rPr>
+                <w:rFonts w:ascii="Calibri" w:eastAsia="Times New Roman" w:hAnsi="Calibri" w:cs="Calibri"/>
+                <w:color w:val="000000"/>
+                <w:sz w:val="18"/>
+                <w:szCs w:val="18"/>
+                <w:lang w:eastAsia="es-MX"/>
+              </w:rPr>
+              <w:t xml:space="preserve"> }}</w:t>
             </w:r>
           </w:p>
         </w:tc>
@@ -2765,7 +3141,29 @@
                 <w:szCs w:val="18"/>
                 <w:lang w:eastAsia="es-MX"/>
               </w:rPr>
-              <w:t>{{ liquido_inflamable }}</w:t>
+              <w:t xml:space="preserve">{{ </w:t>
+            </w:r>
+            <w:proofErr w:type="spellStart"/>
+            <w:r>
+              <w:rPr>
+                <w:rFonts w:ascii="Calibri" w:eastAsia="Times New Roman" w:hAnsi="Calibri" w:cs="Calibri"/>
+                <w:color w:val="000000"/>
+                <w:sz w:val="18"/>
+                <w:szCs w:val="18"/>
+                <w:lang w:eastAsia="es-MX"/>
+              </w:rPr>
+              <w:t>liquido_inflamable</w:t>
+            </w:r>
+            <w:proofErr w:type="spellEnd"/>
+            <w:r>
+              <w:rPr>
+                <w:rFonts w:ascii="Calibri" w:eastAsia="Times New Roman" w:hAnsi="Calibri" w:cs="Calibri"/>
+                <w:color w:val="000000"/>
+                <w:sz w:val="18"/>
+                <w:szCs w:val="18"/>
+                <w:lang w:eastAsia="es-MX"/>
+              </w:rPr>
+              <w:t xml:space="preserve"> }}</w:t>
             </w:r>
           </w:p>
         </w:tc>
@@ -2796,6 +3194,7 @@
                 <w:lang w:eastAsia="es-MX"/>
               </w:rPr>
             </w:pPr>
+            <w:proofErr w:type="spellStart"/>
             <w:r>
               <w:rPr>
                 <w:rFonts w:ascii="Calibri" w:eastAsia="Times New Roman" w:hAnsi="Calibri" w:cs="Calibri"/>
@@ -2806,6 +3205,7 @@
               </w:rPr>
               <w:t>Lt</w:t>
             </w:r>
+            <w:proofErr w:type="spellEnd"/>
           </w:p>
         </w:tc>
       </w:tr>
@@ -3092,7 +3492,29 @@
                 <w:szCs w:val="18"/>
                 <w:lang w:eastAsia="es-MX"/>
               </w:rPr>
-              <w:t>{{ descrip_lc }}</w:t>
+              <w:t xml:space="preserve">{{ </w:t>
+            </w:r>
+            <w:proofErr w:type="spellStart"/>
+            <w:r>
+              <w:rPr>
+                <w:rFonts w:ascii="Calibri" w:eastAsia="Times New Roman" w:hAnsi="Calibri" w:cs="Calibri"/>
+                <w:color w:val="000000"/>
+                <w:sz w:val="18"/>
+                <w:szCs w:val="18"/>
+                <w:lang w:eastAsia="es-MX"/>
+              </w:rPr>
+              <w:t>descrip_lc</w:t>
+            </w:r>
+            <w:proofErr w:type="spellEnd"/>
+            <w:r>
+              <w:rPr>
+                <w:rFonts w:ascii="Calibri" w:eastAsia="Times New Roman" w:hAnsi="Calibri" w:cs="Calibri"/>
+                <w:color w:val="000000"/>
+                <w:sz w:val="18"/>
+                <w:szCs w:val="18"/>
+                <w:lang w:eastAsia="es-MX"/>
+              </w:rPr>
+              <w:t xml:space="preserve"> }}</w:t>
             </w:r>
           </w:p>
         </w:tc>
@@ -3130,7 +3552,29 @@
                 <w:szCs w:val="18"/>
                 <w:lang w:eastAsia="es-MX"/>
               </w:rPr>
-              <w:t>{{ liquido_combustible }}</w:t>
+              <w:t xml:space="preserve">{{ </w:t>
+            </w:r>
+            <w:proofErr w:type="spellStart"/>
+            <w:r>
+              <w:rPr>
+                <w:rFonts w:ascii="Calibri" w:eastAsia="Times New Roman" w:hAnsi="Calibri" w:cs="Calibri"/>
+                <w:color w:val="000000"/>
+                <w:sz w:val="18"/>
+                <w:szCs w:val="18"/>
+                <w:lang w:eastAsia="es-MX"/>
+              </w:rPr>
+              <w:t>liquido_combustible</w:t>
+            </w:r>
+            <w:proofErr w:type="spellEnd"/>
+            <w:r>
+              <w:rPr>
+                <w:rFonts w:ascii="Calibri" w:eastAsia="Times New Roman" w:hAnsi="Calibri" w:cs="Calibri"/>
+                <w:color w:val="000000"/>
+                <w:sz w:val="18"/>
+                <w:szCs w:val="18"/>
+                <w:lang w:eastAsia="es-MX"/>
+              </w:rPr>
+              <w:t xml:space="preserve"> }}</w:t>
             </w:r>
           </w:p>
         </w:tc>
@@ -3160,6 +3604,7 @@
                 <w:lang w:eastAsia="es-MX"/>
               </w:rPr>
             </w:pPr>
+            <w:proofErr w:type="spellStart"/>
             <w:r>
               <w:rPr>
                 <w:rFonts w:ascii="Calibri" w:eastAsia="Times New Roman" w:hAnsi="Calibri" w:cs="Calibri"/>
@@ -3170,6 +3615,7 @@
               </w:rPr>
               <w:t>Lt</w:t>
             </w:r>
+            <w:proofErr w:type="spellEnd"/>
           </w:p>
         </w:tc>
       </w:tr>
@@ -3466,7 +3912,29 @@
                 <w:szCs w:val="18"/>
                 <w:lang w:eastAsia="es-MX"/>
               </w:rPr>
-              <w:t>{{ descrip_sc }}</w:t>
+              <w:t xml:space="preserve">{{ </w:t>
+            </w:r>
+            <w:proofErr w:type="spellStart"/>
+            <w:r>
+              <w:rPr>
+                <w:rFonts w:ascii="Calibri" w:eastAsia="Times New Roman" w:hAnsi="Calibri" w:cs="Calibri"/>
+                <w:color w:val="000000"/>
+                <w:sz w:val="18"/>
+                <w:szCs w:val="18"/>
+                <w:lang w:eastAsia="es-MX"/>
+              </w:rPr>
+              <w:t>descrip_sc</w:t>
+            </w:r>
+            <w:proofErr w:type="spellEnd"/>
+            <w:r>
+              <w:rPr>
+                <w:rFonts w:ascii="Calibri" w:eastAsia="Times New Roman" w:hAnsi="Calibri" w:cs="Calibri"/>
+                <w:color w:val="000000"/>
+                <w:sz w:val="18"/>
+                <w:szCs w:val="18"/>
+                <w:lang w:eastAsia="es-MX"/>
+              </w:rPr>
+              <w:t xml:space="preserve"> }}</w:t>
             </w:r>
           </w:p>
         </w:tc>
@@ -3504,7 +3972,29 @@
                 <w:szCs w:val="18"/>
                 <w:lang w:eastAsia="es-MX"/>
               </w:rPr>
-              <w:t>{{ solido_combusible }}</w:t>
+              <w:t xml:space="preserve">{{ </w:t>
+            </w:r>
+            <w:proofErr w:type="spellStart"/>
+            <w:r>
+              <w:rPr>
+                <w:rFonts w:ascii="Calibri" w:eastAsia="Times New Roman" w:hAnsi="Calibri" w:cs="Calibri"/>
+                <w:color w:val="000000"/>
+                <w:sz w:val="18"/>
+                <w:szCs w:val="18"/>
+                <w:lang w:eastAsia="es-MX"/>
+              </w:rPr>
+              <w:t>solido_combusible</w:t>
+            </w:r>
+            <w:proofErr w:type="spellEnd"/>
+            <w:r>
+              <w:rPr>
+                <w:rFonts w:ascii="Calibri" w:eastAsia="Times New Roman" w:hAnsi="Calibri" w:cs="Calibri"/>
+                <w:color w:val="000000"/>
+                <w:sz w:val="18"/>
+                <w:szCs w:val="18"/>
+                <w:lang w:eastAsia="es-MX"/>
+              </w:rPr>
+              <w:t xml:space="preserve"> }}</w:t>
             </w:r>
           </w:p>
         </w:tc>
@@ -4264,7 +4754,23 @@
                 <w:sz w:val="18"/>
                 <w:szCs w:val="18"/>
               </w:rPr>
-              <w:t>{{ valor_gi }}</w:t>
+              <w:t xml:space="preserve">{{ </w:t>
+            </w:r>
+            <w:proofErr w:type="spellStart"/>
+            <w:r>
+              <w:rPr>
+                <w:sz w:val="18"/>
+                <w:szCs w:val="18"/>
+              </w:rPr>
+              <w:t>valor_gi</w:t>
+            </w:r>
+            <w:proofErr w:type="spellEnd"/>
+            <w:r>
+              <w:rPr>
+                <w:sz w:val="18"/>
+                <w:szCs w:val="18"/>
+              </w:rPr>
+              <w:t xml:space="preserve"> }}</w:t>
             </w:r>
           </w:p>
         </w:tc>
@@ -4411,7 +4917,23 @@
                 <w:sz w:val="18"/>
                 <w:szCs w:val="18"/>
               </w:rPr>
-              <w:t>{{ valor_li }}</w:t>
+              <w:t xml:space="preserve">{{ </w:t>
+            </w:r>
+            <w:proofErr w:type="spellStart"/>
+            <w:r>
+              <w:rPr>
+                <w:sz w:val="18"/>
+                <w:szCs w:val="18"/>
+              </w:rPr>
+              <w:t>valor_li</w:t>
+            </w:r>
+            <w:proofErr w:type="spellEnd"/>
+            <w:r>
+              <w:rPr>
+                <w:sz w:val="18"/>
+                <w:szCs w:val="18"/>
+              </w:rPr>
+              <w:t xml:space="preserve"> }}</w:t>
             </w:r>
           </w:p>
         </w:tc>
@@ -4561,7 +5083,29 @@
                 <w:szCs w:val="18"/>
                 <w:lang w:eastAsia="es-MX"/>
               </w:rPr>
-              <w:t>{{ valor_lc }}</w:t>
+              <w:t xml:space="preserve">{{ </w:t>
+            </w:r>
+            <w:proofErr w:type="spellStart"/>
+            <w:r>
+              <w:rPr>
+                <w:rFonts w:ascii="Calibri" w:eastAsia="Times New Roman" w:hAnsi="Calibri" w:cs="Calibri"/>
+                <w:color w:val="000000"/>
+                <w:sz w:val="18"/>
+                <w:szCs w:val="18"/>
+                <w:lang w:eastAsia="es-MX"/>
+              </w:rPr>
+              <w:t>valor_lc</w:t>
+            </w:r>
+            <w:proofErr w:type="spellEnd"/>
+            <w:r>
+              <w:rPr>
+                <w:rFonts w:ascii="Calibri" w:eastAsia="Times New Roman" w:hAnsi="Calibri" w:cs="Calibri"/>
+                <w:color w:val="000000"/>
+                <w:sz w:val="18"/>
+                <w:szCs w:val="18"/>
+                <w:lang w:eastAsia="es-MX"/>
+              </w:rPr>
+              <w:t xml:space="preserve"> }}</w:t>
             </w:r>
           </w:p>
         </w:tc>
@@ -4708,7 +5252,23 @@
                 <w:sz w:val="18"/>
                 <w:szCs w:val="18"/>
               </w:rPr>
-              <w:t>{{ valor_sc }}</w:t>
+              <w:t xml:space="preserve">{{ </w:t>
+            </w:r>
+            <w:proofErr w:type="spellStart"/>
+            <w:r>
+              <w:rPr>
+                <w:sz w:val="18"/>
+                <w:szCs w:val="18"/>
+              </w:rPr>
+              <w:t>valor_sc</w:t>
+            </w:r>
+            <w:proofErr w:type="spellEnd"/>
+            <w:r>
+              <w:rPr>
+                <w:sz w:val="18"/>
+                <w:szCs w:val="18"/>
+              </w:rPr>
+              <w:t xml:space="preserve"> }}</w:t>
             </w:r>
           </w:p>
         </w:tc>
@@ -5005,7 +5565,25 @@
                 <w:color w:val="000000"/>
                 <w:lang w:eastAsia="es-MX"/>
               </w:rPr>
-              <w:t>{{ dia }}</w:t>
+              <w:t xml:space="preserve">{{ </w:t>
+            </w:r>
+            <w:proofErr w:type="spellStart"/>
+            <w:r>
+              <w:rPr>
+                <w:rFonts w:ascii="Calibri" w:eastAsia="Times New Roman" w:hAnsi="Calibri" w:cs="Calibri"/>
+                <w:color w:val="000000"/>
+                <w:lang w:eastAsia="es-MX"/>
+              </w:rPr>
+              <w:t>dia</w:t>
+            </w:r>
+            <w:proofErr w:type="spellEnd"/>
+            <w:r>
+              <w:rPr>
+                <w:rFonts w:ascii="Calibri" w:eastAsia="Times New Roman" w:hAnsi="Calibri" w:cs="Calibri"/>
+                <w:color w:val="000000"/>
+                <w:lang w:eastAsia="es-MX"/>
+              </w:rPr>
+              <w:t xml:space="preserve"> }}</w:t>
             </w:r>
             <w:r>
               <w:rPr>
@@ -5037,7 +5615,25 @@
                 <w:color w:val="000000"/>
                 <w:lang w:eastAsia="es-MX"/>
               </w:rPr>
-              <w:t>{{ anio }}</w:t>
+              <w:t xml:space="preserve">{{ </w:t>
+            </w:r>
+            <w:proofErr w:type="spellStart"/>
+            <w:r>
+              <w:rPr>
+                <w:rFonts w:ascii="Calibri" w:eastAsia="Times New Roman" w:hAnsi="Calibri" w:cs="Calibri"/>
+                <w:color w:val="000000"/>
+                <w:lang w:eastAsia="es-MX"/>
+              </w:rPr>
+              <w:t>anio</w:t>
+            </w:r>
+            <w:proofErr w:type="spellEnd"/>
+            <w:r>
+              <w:rPr>
+                <w:rFonts w:ascii="Calibri" w:eastAsia="Times New Roman" w:hAnsi="Calibri" w:cs="Calibri"/>
+                <w:color w:val="000000"/>
+                <w:lang w:eastAsia="es-MX"/>
+              </w:rPr>
+              <w:t xml:space="preserve"> }}</w:t>
             </w:r>
           </w:p>
         </w:tc>
@@ -5068,6 +5664,7 @@
                 <w:lang w:eastAsia="es-MX"/>
               </w:rPr>
             </w:pPr>
+            <w:proofErr w:type="spellStart"/>
             <w:r>
               <w:rPr>
                 <w:rFonts w:ascii="Calibri" w:eastAsia="Times New Roman" w:hAnsi="Calibri" w:cs="Calibri"/>
@@ -5076,7 +5673,18 @@
                 <w:szCs w:val="18"/>
                 <w:lang w:eastAsia="es-MX"/>
               </w:rPr>
-              <w:t>Sup. Construida (m2):</w:t>
+              <w:t>Sup</w:t>
+            </w:r>
+            <w:proofErr w:type="spellEnd"/>
+            <w:r>
+              <w:rPr>
+                <w:rFonts w:ascii="Calibri" w:eastAsia="Times New Roman" w:hAnsi="Calibri" w:cs="Calibri"/>
+                <w:color w:val="000000"/>
+                <w:sz w:val="18"/>
+                <w:szCs w:val="18"/>
+                <w:lang w:eastAsia="es-MX"/>
+              </w:rPr>
+              <w:t>. Construida (m2):</w:t>
             </w:r>
           </w:p>
         </w:tc>
@@ -5265,7 +5873,33 @@
                 <w:szCs w:val="18"/>
                 <w:lang w:eastAsia="es-MX"/>
               </w:rPr>
-              <w:t>{{ tipo_riesgo }}</w:t>
+              <w:t xml:space="preserve">{{ </w:t>
+            </w:r>
+            <w:proofErr w:type="spellStart"/>
+            <w:r>
+              <w:rPr>
+                <w:rFonts w:ascii="Calibri" w:eastAsia="Times New Roman" w:hAnsi="Calibri" w:cs="Calibri"/>
+                <w:b/>
+                <w:bCs/>
+                <w:color w:val="FF0000"/>
+                <w:sz w:val="18"/>
+                <w:szCs w:val="18"/>
+                <w:lang w:eastAsia="es-MX"/>
+              </w:rPr>
+              <w:t>tipo_riesgo</w:t>
+            </w:r>
+            <w:proofErr w:type="spellEnd"/>
+            <w:r>
+              <w:rPr>
+                <w:rFonts w:ascii="Calibri" w:eastAsia="Times New Roman" w:hAnsi="Calibri" w:cs="Calibri"/>
+                <w:b/>
+                <w:bCs/>
+                <w:color w:val="FF0000"/>
+                <w:sz w:val="18"/>
+                <w:szCs w:val="18"/>
+                <w:lang w:eastAsia="es-MX"/>
+              </w:rPr>
+              <w:t xml:space="preserve"> }}</w:t>
             </w:r>
           </w:p>
         </w:tc>
@@ -12326,14 +12960,7 @@
                               <w:sz w:val="18"/>
                               <w:szCs w:val="18"/>
                             </w:rPr>
-                            <w:t xml:space="preserve">CORREO: </w:t>
-                          </w:r>
-                          <w:r>
-                            <w:rPr>
-                              <w:sz w:val="18"/>
-                              <w:szCs w:val="18"/>
-                            </w:rPr>
-                            <w:t>halcon_noe@yahoo.com.mx</w:t>
+                            <w:t>CORREO: halcon_noe@yahoo.com.mx</w:t>
                           </w:r>
                         </w:p>
                       </w:txbxContent>
@@ -12758,7 +13385,23 @@
         <w:rFonts w:cstheme="minorHAnsi"/>
         <w:b/>
       </w:rPr>
-      <w:t>**Anio_actual**</w:t>
+      <w:t>**</w:t>
+    </w:r>
+    <w:proofErr w:type="spellStart"/>
+    <w:r>
+      <w:rPr>
+        <w:rFonts w:cstheme="minorHAnsi"/>
+        <w:b/>
+      </w:rPr>
+      <w:t>Anio_actual</w:t>
+    </w:r>
+    <w:proofErr w:type="spellEnd"/>
+    <w:r>
+      <w:rPr>
+        <w:rFonts w:cstheme="minorHAnsi"/>
+        <w:b/>
+      </w:rPr>
+      <w:t>**</w:t>
     </w:r>
   </w:p>
   <w:p>
@@ -12780,7 +13423,23 @@
         <w:rFonts w:cstheme="minorHAnsi"/>
         <w:b/>
       </w:rPr>
-      <w:t>**Razon_social**</w:t>
+      <w:t>**</w:t>
+    </w:r>
+    <w:proofErr w:type="spellStart"/>
+    <w:r>
+      <w:rPr>
+        <w:rFonts w:cstheme="minorHAnsi"/>
+        <w:b/>
+      </w:rPr>
+      <w:t>Razon_social</w:t>
+    </w:r>
+    <w:proofErr w:type="spellEnd"/>
+    <w:r>
+      <w:rPr>
+        <w:rFonts w:cstheme="minorHAnsi"/>
+        <w:b/>
+      </w:rPr>
+      <w:t>**</w:t>
     </w:r>
   </w:p>
   <w:p>
@@ -12797,7 +13456,21 @@
       <w:rPr>
         <w:b/>
       </w:rPr>
-      <w:t>**Nombre_comercial**</w:t>
+      <w:t>**</w:t>
+    </w:r>
+    <w:proofErr w:type="spellStart"/>
+    <w:r>
+      <w:rPr>
+        <w:b/>
+      </w:rPr>
+      <w:t>Nombre_comercial</w:t>
+    </w:r>
+    <w:proofErr w:type="spellEnd"/>
+    <w:r>
+      <w:rPr>
+        <w:b/>
+      </w:rPr>
+      <w:t>**</w:t>
     </w:r>
   </w:p>
 </w:hdr>

</xml_diff>